<commit_message>
Enhance customer management in AimaBike POS API by adding new status handling features. Introduced endpoints for approving and returning customers, updated customer model to include status, and modified related services and documentation accordingly. Improved Postman collection with new API descriptions and examples.
</commit_message>
<xml_diff>
--- a/docs/MODELS_TABLES.docx
+++ b/docs/MODELS_TABLES.docx
@@ -9,7 +9,7 @@
         <w:bidi w:val="false"/>
         <w:spacing w:before="480" w:after="120"/>
       </w:pPr>
-      <w:bookmarkStart w:name="_Toc_Models_Folder_Table_Data_Database_Schema_1771791938000" w:id="1"/>
+      <w:bookmarkStart w:name="_Toc_Models_Folder_Table_Data_Database_Schema_1771833788844" w:id="1"/>
       <w:r>
         <w:rPr>
           <w:b w:val="false"/>
@@ -100,7 +100,7 @@
         <w:bidi w:val="false"/>
         <w:spacing w:before="240" w:after="120"/>
       </w:pPr>
-      <w:bookmarkStart w:name="_Toc__1_User_user_1771791938005" w:id="1"/>
+      <w:bookmarkStart w:name="_Toc__1_User_user_1771833788847" w:id="1"/>
       <w:r>
         <w:rPr>
           <w:b w:val="false"/>
@@ -1086,7 +1086,7 @@
         <w:bidi w:val="false"/>
         <w:spacing w:before="240" w:after="120"/>
       </w:pPr>
-      <w:bookmarkStart w:name="_Toc__2_UserRole_userRole_1771791938012" w:id="1"/>
+      <w:bookmarkStart w:name="_Toc__2_UserRole_userRole_1771833788850" w:id="1"/>
       <w:r>
         <w:rPr>
           <w:b w:val="false"/>
@@ -1496,7 +1496,7 @@
         <w:bidi w:val="false"/>
         <w:spacing w:before="240" w:after="120"/>
       </w:pPr>
-      <w:bookmarkStart w:name="_Toc__3_UserLogs_userLogs_1771791938013" w:id="1"/>
+      <w:bookmarkStart w:name="_Toc__3_UserLogs_userLogs_1771833788850" w:id="1"/>
       <w:r>
         <w:rPr>
           <w:b w:val="false"/>
@@ -1978,7 +1978,7 @@
         <w:bidi w:val="false"/>
         <w:spacing w:before="240" w:after="120"/>
       </w:pPr>
-      <w:bookmarkStart w:name="_Toc__4_Category_category_1771791938013" w:id="1"/>
+      <w:bookmarkStart w:name="_Toc__4_Category_category_1771833788851" w:id="1"/>
       <w:r>
         <w:rPr>
           <w:b w:val="false"/>
@@ -2388,7 +2388,7 @@
         <w:bidi w:val="false"/>
         <w:spacing w:before="240" w:after="120"/>
       </w:pPr>
-      <w:bookmarkStart w:name="_Toc__5_Model_model_1771791938014" w:id="1"/>
+      <w:bookmarkStart w:name="_Toc__5_Model_model_1771833788851" w:id="1"/>
       <w:r>
         <w:rPr>
           <w:b w:val="false"/>
@@ -2942,7 +2942,7 @@
         <w:bidi w:val="false"/>
         <w:spacing w:before="240" w:after="120"/>
       </w:pPr>
-      <w:bookmarkStart w:name="_Toc__6_Stock_stock_1771791938015" w:id="1"/>
+      <w:bookmarkStart w:name="_Toc__6_Stock_stock_1771833788852" w:id="1"/>
       <w:r>
         <w:rPr>
           <w:b w:val="false"/>
@@ -3784,7 +3784,7 @@
         <w:bidi w:val="false"/>
         <w:spacing w:before="240" w:after="120"/>
       </w:pPr>
-      <w:bookmarkStart w:name="_Toc__7_Payment_payment_1771791938016" w:id="1"/>
+      <w:bookmarkStart w:name="_Toc__7_Payment_payment_1771833788852" w:id="1"/>
       <w:r>
         <w:rPr>
           <w:b w:val="false"/>
@@ -4194,7 +4194,7 @@
         <w:bidi w:val="false"/>
         <w:spacing w:before="240" w:after="120"/>
       </w:pPr>
-      <w:bookmarkStart w:name="_Toc__8_Cash_cash_1771791938016" w:id="1"/>
+      <w:bookmarkStart w:name="_Toc__8_Cash_cash_1771833788852" w:id="1"/>
       <w:r>
         <w:rPr>
           <w:b w:val="false"/>
@@ -5108,7 +5108,7 @@
         <w:bidi w:val="false"/>
         <w:spacing w:before="240" w:after="120"/>
       </w:pPr>
-      <w:bookmarkStart w:name="_Toc__9_Lease_lease_1771791938017" w:id="1"/>
+      <w:bookmarkStart w:name="_Toc__9_Lease_lease_1771833788853" w:id="1"/>
       <w:r>
         <w:rPr>
           <w:b w:val="false"/>
@@ -6166,7 +6166,7 @@
         <w:bidi w:val="false"/>
         <w:spacing w:before="240" w:after="120"/>
       </w:pPr>
-      <w:bookmarkStart w:name="_Toc__10_Customer_customer_1771791938018" w:id="1"/>
+      <w:bookmarkStart w:name="_Toc__10_Customer_customer_1771833788854" w:id="1"/>
       <w:r>
         <w:rPr>
           <w:b w:val="false"/>
@@ -8176,6 +8176,78 @@
                 <w:rtl w:val="false"/>
               </w:rPr>
               <w:t xml:space="preserve"/>
+            </w:r>
+          </w:p>
+        </w:tc>
+      </w:tr>
+      <w:tr>
+        <w:tc>
+          <w:p>
+            <w:pPr>
+              <w:jc w:val="left"/>
+            </w:pPr>
+            <w:r>
+              <w:rPr>
+                <w:color w:val="000000"/>
+                <w:rtl w:val="false"/>
+              </w:rPr>
+              <w:t xml:space="preserve">status</w:t>
+            </w:r>
+          </w:p>
+        </w:tc>
+        <w:tc>
+          <w:p>
+            <w:pPr>
+              <w:jc w:val="left"/>
+            </w:pPr>
+            <w:r>
+              <w:rPr>
+                <w:color w:val="000000"/>
+                <w:rtl w:val="false"/>
+              </w:rPr>
+              <w:t xml:space="preserve">STRING</w:t>
+            </w:r>
+          </w:p>
+        </w:tc>
+        <w:tc>
+          <w:p>
+            <w:pPr>
+              <w:jc w:val="left"/>
+            </w:pPr>
+            <w:r>
+              <w:rPr>
+                <w:color w:val="000000"/>
+                <w:rtl w:val="false"/>
+              </w:rPr>
+              <w:t xml:space="preserve">Yes</w:t>
+            </w:r>
+          </w:p>
+        </w:tc>
+        <w:tc>
+          <w:p>
+            <w:pPr>
+              <w:jc w:val="left"/>
+            </w:pPr>
+            <w:r>
+              <w:rPr>
+                <w:color w:val="000000"/>
+                <w:rtl w:val="false"/>
+              </w:rPr>
+              <w:t xml:space="preserve">pending</w:t>
+            </w:r>
+          </w:p>
+        </w:tc>
+        <w:tc>
+          <w:p>
+            <w:pPr>
+              <w:jc w:val="left"/>
+            </w:pPr>
+            <w:r>
+              <w:rPr>
+                <w:color w:val="000000"/>
+                <w:rtl w:val="false"/>
+              </w:rPr>
+              <w:t xml:space="preserve">pending, complete, return</w:t>
             </w:r>
           </w:p>
         </w:tc>
@@ -8232,7 +8304,7 @@
         <w:bidi w:val="false"/>
         <w:spacing w:before="240" w:after="120"/>
       </w:pPr>
-      <w:bookmarkStart w:name="_Toc__11_DealerConsignmentNote_dealerConsignm_1771791938019" w:id="1"/>
+      <w:bookmarkStart w:name="_Toc__11_DealerConsignmentNote_dealerConsignm_1771833788855" w:id="1"/>
       <w:r>
         <w:rPr>
           <w:b w:val="false"/>
@@ -9218,7 +9290,7 @@
         <w:bidi w:val="false"/>
         <w:spacing w:before="240" w:after="120"/>
       </w:pPr>
-      <w:bookmarkStart w:name="_Toc__12_DealerConsignmentNoteItem_dealerCons_1771791938020" w:id="1"/>
+      <w:bookmarkStart w:name="_Toc__12_DealerConsignmentNoteItem_dealerCons_1771833788855" w:id="1"/>
       <w:r>
         <w:rPr>
           <w:b w:val="false"/>
@@ -9988,7 +10060,7 @@
         <w:bidi w:val="false"/>
         <w:spacing w:before="240" w:after="120"/>
       </w:pPr>
-      <w:bookmarkStart w:name="_Toc__13_ShopDetail_shopDetails_1771791938021" w:id="1"/>
+      <w:bookmarkStart w:name="_Toc__13_ShopDetail_shopDetails_1771833788855" w:id="1"/>
       <w:r>
         <w:rPr>
           <w:b w:val="false"/>
@@ -10614,7 +10686,7 @@
         <w:bidi w:val="false"/>
         <w:spacing w:before="240" w:after="120"/>
       </w:pPr>
-      <w:bookmarkStart w:name="_Toc_Associations_from_modelsindexjs_1771791938022" w:id="1"/>
+      <w:bookmarkStart w:name="_Toc_Associations_from_modelsindexjs_1771833788856" w:id="1"/>
       <w:r>
         <w:rPr>
           <w:b w:val="false"/>
@@ -11801,7 +11873,7 @@
         <w:bidi w:val="false"/>
         <w:spacing w:before="240" w:after="120"/>
       </w:pPr>
-      <w:bookmarkStart w:name="_Toc_APIs_by_resource_1771791938023" w:id="1"/>
+      <w:bookmarkStart w:name="_Toc_APIs_by_resource_1771833788856" w:id="1"/>
       <w:r>
         <w:rPr>
           <w:b w:val="false"/>
@@ -11824,7 +11896,7 @@
         <w:bidi w:val="false"/>
         <w:spacing w:before="240" w:after="120"/>
       </w:pPr>
-      <w:bookmarkStart w:name="_Toc_User_user_1771791938023" w:id="1"/>
+      <w:bookmarkStart w:name="_Toc_User_user_1771833788856" w:id="1"/>
       <w:r>
         <w:rPr>
           <w:b w:val="false"/>
@@ -12374,7 +12446,7 @@
         <w:bidi w:val="false"/>
         <w:spacing w:before="240" w:after="120"/>
       </w:pPr>
-      <w:bookmarkStart w:name="_Toc_UserRole_userRole_1771791938024" w:id="1"/>
+      <w:bookmarkStart w:name="_Toc_UserRole_userRole_1771833788857" w:id="1"/>
       <w:r>
         <w:rPr>
           <w:b w:val="false"/>
@@ -12572,7 +12644,7 @@
         <w:bidi w:val="false"/>
         <w:spacing w:before="240" w:after="120"/>
       </w:pPr>
-      <w:bookmarkStart w:name="_Toc_UserLogs_userLogs_1771791938024" w:id="1"/>
+      <w:bookmarkStart w:name="_Toc_UserLogs_userLogs_1771833788857" w:id="1"/>
       <w:r>
         <w:rPr>
           <w:b w:val="false"/>
@@ -12770,7 +12842,7 @@
         <w:bidi w:val="false"/>
         <w:spacing w:before="240" w:after="120"/>
       </w:pPr>
-      <w:bookmarkStart w:name="_Toc_Category_category_1771791938024" w:id="1"/>
+      <w:bookmarkStart w:name="_Toc_Category_category_1771833788857" w:id="1"/>
       <w:r>
         <w:rPr>
           <w:b w:val="false"/>
@@ -13100,7 +13172,7 @@
         <w:bidi w:val="false"/>
         <w:spacing w:before="240" w:after="120"/>
       </w:pPr>
-      <w:bookmarkStart w:name="_Toc_Model_model_1771791938024" w:id="1"/>
+      <w:bookmarkStart w:name="_Toc_Model_model_1771833788857" w:id="1"/>
       <w:r>
         <w:rPr>
           <w:b w:val="false"/>
@@ -13474,7 +13546,7 @@
         <w:bidi w:val="false"/>
         <w:spacing w:before="240" w:after="120"/>
       </w:pPr>
-      <w:bookmarkStart w:name="_Toc_Stock_stock_1771791938025" w:id="1"/>
+      <w:bookmarkStart w:name="_Toc_Stock_stock_1771833788857" w:id="1"/>
       <w:r>
         <w:rPr>
           <w:b w:val="false"/>
@@ -13936,7 +14008,7 @@
         <w:bidi w:val="false"/>
         <w:spacing w:before="240" w:after="120"/>
       </w:pPr>
-      <w:bookmarkStart w:name="_Toc_Payment_payment_1771791938025" w:id="1"/>
+      <w:bookmarkStart w:name="_Toc_Payment_payment_1771833788857" w:id="1"/>
       <w:r>
         <w:rPr>
           <w:b w:val="false"/>
@@ -14222,7 +14294,7 @@
         <w:bidi w:val="false"/>
         <w:spacing w:before="240" w:after="120"/>
       </w:pPr>
-      <w:bookmarkStart w:name="_Toc_Cash_cash_1771791938025" w:id="1"/>
+      <w:bookmarkStart w:name="_Toc_Cash_cash_1771833788857" w:id="1"/>
       <w:r>
         <w:rPr>
           <w:b w:val="false"/>
@@ -14508,7 +14580,7 @@
         <w:bidi w:val="false"/>
         <w:spacing w:before="240" w:after="120"/>
       </w:pPr>
-      <w:bookmarkStart w:name="_Toc_Lease_lease_1771791938025" w:id="1"/>
+      <w:bookmarkStart w:name="_Toc_Lease_lease_1771833788857" w:id="1"/>
       <w:r>
         <w:rPr>
           <w:b w:val="false"/>
@@ -14838,7 +14910,7 @@
         <w:bidi w:val="false"/>
         <w:spacing w:before="240" w:after="120"/>
       </w:pPr>
-      <w:bookmarkStart w:name="_Toc_Customer_customer_1771791938026" w:id="1"/>
+      <w:bookmarkStart w:name="_Toc_Customer_customer_1771833788858" w:id="1"/>
       <w:r>
         <w:rPr>
           <w:b w:val="false"/>
@@ -14979,7 +15051,7 @@
                 <w:color w:val="000000"/>
                 <w:rtl w:val="false"/>
               </w:rPr>
-              <w:t xml:space="preserve">Save with lease/cash</w:t>
+              <w:t xml:space="preserve">Save with lease/cash (status=pending, stock −1)</w:t>
             </w:r>
           </w:p>
         </w:tc>
@@ -15288,6 +15360,94 @@
                 <w:rtl w:val="false"/>
               </w:rPr>
               <w:t xml:space="preserve">Update status</w:t>
+            </w:r>
+          </w:p>
+        </w:tc>
+      </w:tr>
+      <w:tr>
+        <w:tc>
+          <w:p>
+            <w:pPr>
+              <w:jc w:val="left"/>
+            </w:pPr>
+            <w:r>
+              <w:rPr>
+                <w:color w:val="000000"/>
+                <w:rtl w:val="false"/>
+              </w:rPr>
+              <w:t xml:space="preserve">POST</w:t>
+            </w:r>
+          </w:p>
+        </w:tc>
+        <w:tc>
+          <w:p>
+            <w:pPr>
+              <w:jc w:val="left"/>
+            </w:pPr>
+            <w:r>
+              <w:rPr>
+                <w:color w:val="000000"/>
+                <w:rtl w:val="false"/>
+              </w:rPr>
+              <w:t xml:space="preserve">/customer/approved</w:t>
+            </w:r>
+          </w:p>
+        </w:tc>
+        <w:tc>
+          <w:p>
+            <w:pPr>
+              <w:jc w:val="left"/>
+            </w:pPr>
+            <w:r>
+              <w:rPr>
+                <w:color w:val="000000"/>
+                <w:rtl w:val="false"/>
+              </w:rPr>
+              <w:t xml:space="preserve">Approve customer (status=complete)</w:t>
+            </w:r>
+          </w:p>
+        </w:tc>
+      </w:tr>
+      <w:tr>
+        <w:tc>
+          <w:p>
+            <w:pPr>
+              <w:jc w:val="left"/>
+            </w:pPr>
+            <w:r>
+              <w:rPr>
+                <w:color w:val="000000"/>
+                <w:rtl w:val="false"/>
+              </w:rPr>
+              <w:t xml:space="preserve">POST</w:t>
+            </w:r>
+          </w:p>
+        </w:tc>
+        <w:tc>
+          <w:p>
+            <w:pPr>
+              <w:jc w:val="left"/>
+            </w:pPr>
+            <w:r>
+              <w:rPr>
+                <w:color w:val="000000"/>
+                <w:rtl w:val="false"/>
+              </w:rPr>
+              <w:t xml:space="preserve">/customer/return</w:t>
+            </w:r>
+          </w:p>
+        </w:tc>
+        <w:tc>
+          <w:p>
+            <w:pPr>
+              <w:jc w:val="left"/>
+            </w:pPr>
+            <w:r>
+              <w:rPr>
+                <w:color w:val="000000"/>
+                <w:rtl w:val="false"/>
+              </w:rPr>
+              <w:t xml:space="preserve">Return customer (status=return, stock +1)</w:t>
             </w:r>
           </w:p>
         </w:tc>
@@ -15300,7 +15460,7 @@
         <w:bidi w:val="false"/>
         <w:spacing w:before="240" w:after="120"/>
       </w:pPr>
-      <w:bookmarkStart w:name="_Toc_DealerConsignmentNote_dealerConsignmentN_1771791938026" w:id="1"/>
+      <w:bookmarkStart w:name="_Toc_DealerConsignmentNote_dealerConsignmentN_1771833788858" w:id="1"/>
       <w:r>
         <w:rPr>
           <w:b w:val="false"/>
@@ -15718,7 +15878,7 @@
         <w:bidi w:val="false"/>
         <w:spacing w:before="240" w:after="120"/>
       </w:pPr>
-      <w:bookmarkStart w:name="_Toc_ShopDetails_shopDetails_1771791938026" w:id="1"/>
+      <w:bookmarkStart w:name="_Toc_ShopDetails_shopDetails_1771833788858" w:id="1"/>
       <w:r>
         <w:rPr>
           <w:b w:val="false"/>

</xml_diff>

<commit_message>
Implement courier and transfer management in AimaBike POS API. Added new models, routes, and services for handling couriers and transfers, including endpoints for saving, updating, and retrieving data. Updated Postman collection and SQL dump to reflect these changes, enhancing overall API functionality and documentation.
</commit_message>
<xml_diff>
--- a/docs/MODELS_TABLES.docx
+++ b/docs/MODELS_TABLES.docx
@@ -9,7 +9,7 @@
         <w:bidi w:val="false"/>
         <w:spacing w:before="480" w:after="120"/>
       </w:pPr>
-      <w:bookmarkStart w:name="_Toc_Models_Folder_Table_Data_Database_Schema_1771833788844" w:id="1"/>
+      <w:bookmarkStart w:name="_Toc_Models_Folder_Table_Data_Database_Schema_1771840706566" w:id="1"/>
       <w:r>
         <w:rPr>
           <w:b w:val="false"/>
@@ -100,7 +100,7 @@
         <w:bidi w:val="false"/>
         <w:spacing w:before="240" w:after="120"/>
       </w:pPr>
-      <w:bookmarkStart w:name="_Toc__1_User_user_1771833788847" w:id="1"/>
+      <w:bookmarkStart w:name="_Toc__1_User_user_1771840706568" w:id="1"/>
       <w:r>
         <w:rPr>
           <w:b w:val="false"/>
@@ -1086,7 +1086,7 @@
         <w:bidi w:val="false"/>
         <w:spacing w:before="240" w:after="120"/>
       </w:pPr>
-      <w:bookmarkStart w:name="_Toc__2_UserRole_userRole_1771833788850" w:id="1"/>
+      <w:bookmarkStart w:name="_Toc__2_UserRole_userRole_1771840706571" w:id="1"/>
       <w:r>
         <w:rPr>
           <w:b w:val="false"/>
@@ -1496,7 +1496,7 @@
         <w:bidi w:val="false"/>
         <w:spacing w:before="240" w:after="120"/>
       </w:pPr>
-      <w:bookmarkStart w:name="_Toc__3_UserLogs_userLogs_1771833788850" w:id="1"/>
+      <w:bookmarkStart w:name="_Toc__3_UserLogs_userLogs_1771840706572" w:id="1"/>
       <w:r>
         <w:rPr>
           <w:b w:val="false"/>
@@ -1978,7 +1978,7 @@
         <w:bidi w:val="false"/>
         <w:spacing w:before="240" w:after="120"/>
       </w:pPr>
-      <w:bookmarkStart w:name="_Toc__4_Category_category_1771833788851" w:id="1"/>
+      <w:bookmarkStart w:name="_Toc__4_Category_category_1771840706572" w:id="1"/>
       <w:r>
         <w:rPr>
           <w:b w:val="false"/>
@@ -2388,7 +2388,7 @@
         <w:bidi w:val="false"/>
         <w:spacing w:before="240" w:after="120"/>
       </w:pPr>
-      <w:bookmarkStart w:name="_Toc__5_Model_model_1771833788851" w:id="1"/>
+      <w:bookmarkStart w:name="_Toc__5_Model_model_1771840706572" w:id="1"/>
       <w:r>
         <w:rPr>
           <w:b w:val="false"/>
@@ -2942,7 +2942,7 @@
         <w:bidi w:val="false"/>
         <w:spacing w:before="240" w:after="120"/>
       </w:pPr>
-      <w:bookmarkStart w:name="_Toc__6_Stock_stock_1771833788852" w:id="1"/>
+      <w:bookmarkStart w:name="_Toc__6_Stock_stock_1771840706573" w:id="1"/>
       <w:r>
         <w:rPr>
           <w:b w:val="false"/>
@@ -3784,7 +3784,7 @@
         <w:bidi w:val="false"/>
         <w:spacing w:before="240" w:after="120"/>
       </w:pPr>
-      <w:bookmarkStart w:name="_Toc__7_Payment_payment_1771833788852" w:id="1"/>
+      <w:bookmarkStart w:name="_Toc__7_Payment_payment_1771840706573" w:id="1"/>
       <w:r>
         <w:rPr>
           <w:b w:val="false"/>
@@ -4194,7 +4194,7 @@
         <w:bidi w:val="false"/>
         <w:spacing w:before="240" w:after="120"/>
       </w:pPr>
-      <w:bookmarkStart w:name="_Toc__8_Cash_cash_1771833788852" w:id="1"/>
+      <w:bookmarkStart w:name="_Toc__8_Cash_cash_1771840706574" w:id="1"/>
       <w:r>
         <w:rPr>
           <w:b w:val="false"/>
@@ -5108,7 +5108,7 @@
         <w:bidi w:val="false"/>
         <w:spacing w:before="240" w:after="120"/>
       </w:pPr>
-      <w:bookmarkStart w:name="_Toc__9_Lease_lease_1771833788853" w:id="1"/>
+      <w:bookmarkStart w:name="_Toc__9_Lease_lease_1771840706574" w:id="1"/>
       <w:r>
         <w:rPr>
           <w:b w:val="false"/>
@@ -6166,7 +6166,7 @@
         <w:bidi w:val="false"/>
         <w:spacing w:before="240" w:after="120"/>
       </w:pPr>
-      <w:bookmarkStart w:name="_Toc__10_Customer_customer_1771833788854" w:id="1"/>
+      <w:bookmarkStart w:name="_Toc__10_Customer_customer_1771840706575" w:id="1"/>
       <w:r>
         <w:rPr>
           <w:b w:val="false"/>
@@ -8304,7 +8304,7 @@
         <w:bidi w:val="false"/>
         <w:spacing w:before="240" w:after="120"/>
       </w:pPr>
-      <w:bookmarkStart w:name="_Toc__11_DealerConsignmentNote_dealerConsignm_1771833788855" w:id="1"/>
+      <w:bookmarkStart w:name="_Toc__11_DealerConsignmentNote_dealerConsignm_1771840706575" w:id="1"/>
       <w:r>
         <w:rPr>
           <w:b w:val="false"/>
@@ -9290,7 +9290,7 @@
         <w:bidi w:val="false"/>
         <w:spacing w:before="240" w:after="120"/>
       </w:pPr>
-      <w:bookmarkStart w:name="_Toc__12_DealerConsignmentNoteItem_dealerCons_1771833788855" w:id="1"/>
+      <w:bookmarkStart w:name="_Toc__12_DealerConsignmentNoteItem_dealerCons_1771840706576" w:id="1"/>
       <w:r>
         <w:rPr>
           <w:b w:val="false"/>
@@ -10060,7 +10060,7 @@
         <w:bidi w:val="false"/>
         <w:spacing w:before="240" w:after="120"/>
       </w:pPr>
-      <w:bookmarkStart w:name="_Toc__13_ShopDetail_shopDetails_1771833788855" w:id="1"/>
+      <w:bookmarkStart w:name="_Toc__13_ShopDetail_shopDetails_1771840706576" w:id="1"/>
       <w:r>
         <w:rPr>
           <w:b w:val="false"/>
@@ -10686,7 +10686,1835 @@
         <w:bidi w:val="false"/>
         <w:spacing w:before="240" w:after="120"/>
       </w:pPr>
-      <w:bookmarkStart w:name="_Toc_Associations_from_modelsindexjs_1771833788856" w:id="1"/>
+      <w:bookmarkStart w:name="_Toc__14_Courier_courier_1771840706577" w:id="1"/>
+      <w:r>
+        <w:rPr>
+          <w:b w:val="false"/>
+          <w:bCs w:val="false"/>
+          <w:i w:val="false"/>
+          <w:iCs w:val="false"/>
+          <w:color w:val="000000"/>
+          <w:sz w:val="28"/>
+          <w:szCs w:val="28"/>
+          <w:rtl w:val="false"/>
+        </w:rPr>
+        <w:t xml:space="preserve">14. Courier (`courier`)</w:t>
+      </w:r>
+      <w:bookmarkEnd w:id="1"/>
+    </w:p>
+    <w:tbl>
+      <w:tblPr>
+        <w:tblW w:type="pct" w:w="100%"/>
+        <w:tblBorders>
+          <w:top w:val="single" w:color="auto" w:sz="4"/>
+          <w:left w:val="single" w:color="auto" w:sz="4"/>
+          <w:bottom w:val="single" w:color="auto" w:sz="4"/>
+          <w:right w:val="single" w:color="auto" w:sz="4"/>
+          <w:insideH w:val="single" w:color="auto" w:sz="4"/>
+          <w:insideV w:val="single" w:color="auto" w:sz="4"/>
+        </w:tblBorders>
+        <w:tblLayout w:type="autofit"/>
+        <w:tblCellMar>
+          <w:top w:type="dxa" w:w="100"/>
+          <w:left w:type="dxa" w:w="100"/>
+          <w:bottom w:type="dxa" w:w="100"/>
+          <w:right w:type="dxa" w:w="100"/>
+        </w:tblCellMar>
+      </w:tblPr>
+      <w:tblGrid>
+        <w:gridCol w:w="100"/>
+        <w:gridCol w:w="100"/>
+        <w:gridCol w:w="100"/>
+        <w:gridCol w:w="100"/>
+        <w:gridCol w:w="100"/>
+      </w:tblGrid>
+      <w:tr>
+        <w:trPr>
+          <w:tblHeader/>
+        </w:trPr>
+        <w:tc>
+          <w:tcPr>
+            <w:shd w:fill="F2F2F2"/>
+          </w:tcPr>
+          <w:p>
+            <w:pPr>
+              <w:pStyle w:val="Strong"/>
+              <w:jc w:val="left"/>
+            </w:pPr>
+            <w:r>
+              <w:rPr>
+                <w:b/>
+                <w:bCs/>
+                <w:color w:val="000000"/>
+              </w:rPr>
+              <w:t xml:space="preserve">Column</w:t>
+            </w:r>
+          </w:p>
+        </w:tc>
+        <w:tc>
+          <w:tcPr>
+            <w:shd w:fill="F2F2F2"/>
+          </w:tcPr>
+          <w:p>
+            <w:pPr>
+              <w:pStyle w:val="Strong"/>
+              <w:jc w:val="left"/>
+            </w:pPr>
+            <w:r>
+              <w:rPr>
+                <w:b/>
+                <w:bCs/>
+                <w:color w:val="000000"/>
+              </w:rPr>
+              <w:t xml:space="preserve">Type</w:t>
+            </w:r>
+          </w:p>
+        </w:tc>
+        <w:tc>
+          <w:tcPr>
+            <w:shd w:fill="F2F2F2"/>
+          </w:tcPr>
+          <w:p>
+            <w:pPr>
+              <w:pStyle w:val="Strong"/>
+              <w:jc w:val="left"/>
+            </w:pPr>
+            <w:r>
+              <w:rPr>
+                <w:b/>
+                <w:bCs/>
+                <w:color w:val="000000"/>
+              </w:rPr>
+              <w:t xml:space="preserve">Null</w:t>
+            </w:r>
+          </w:p>
+        </w:tc>
+        <w:tc>
+          <w:tcPr>
+            <w:shd w:fill="F2F2F2"/>
+          </w:tcPr>
+          <w:p>
+            <w:pPr>
+              <w:pStyle w:val="Strong"/>
+              <w:jc w:val="left"/>
+            </w:pPr>
+            <w:r>
+              <w:rPr>
+                <w:b/>
+                <w:bCs/>
+                <w:color w:val="000000"/>
+              </w:rPr>
+              <w:t xml:space="preserve">Default</w:t>
+            </w:r>
+          </w:p>
+        </w:tc>
+        <w:tc>
+          <w:tcPr>
+            <w:shd w:fill="F2F2F2"/>
+          </w:tcPr>
+          <w:p>
+            <w:pPr>
+              <w:pStyle w:val="Strong"/>
+              <w:jc w:val="left"/>
+            </w:pPr>
+            <w:r>
+              <w:rPr>
+                <w:b/>
+                <w:bCs/>
+                <w:color w:val="000000"/>
+              </w:rPr>
+              <w:t xml:space="preserve">Notes</w:t>
+            </w:r>
+          </w:p>
+        </w:tc>
+      </w:tr>
+      <w:tr>
+        <w:tc>
+          <w:p>
+            <w:pPr>
+              <w:jc w:val="left"/>
+            </w:pPr>
+            <w:r>
+              <w:rPr>
+                <w:color w:val="000000"/>
+                <w:rtl w:val="false"/>
+              </w:rPr>
+              <w:t xml:space="preserve">id</w:t>
+            </w:r>
+          </w:p>
+        </w:tc>
+        <w:tc>
+          <w:p>
+            <w:pPr>
+              <w:jc w:val="left"/>
+            </w:pPr>
+            <w:r>
+              <w:rPr>
+                <w:color w:val="000000"/>
+                <w:rtl w:val="false"/>
+              </w:rPr>
+              <w:t xml:space="preserve">INTEGER</w:t>
+            </w:r>
+          </w:p>
+        </w:tc>
+        <w:tc>
+          <w:p>
+            <w:pPr>
+              <w:jc w:val="left"/>
+            </w:pPr>
+            <w:r>
+              <w:rPr>
+                <w:color w:val="000000"/>
+                <w:rtl w:val="false"/>
+              </w:rPr>
+              <w:t xml:space="preserve">No</w:t>
+            </w:r>
+          </w:p>
+        </w:tc>
+        <w:tc>
+          <w:p>
+            <w:pPr>
+              <w:jc w:val="left"/>
+            </w:pPr>
+            <w:r>
+              <w:rPr>
+                <w:color w:val="000000"/>
+                <w:rtl w:val="false"/>
+              </w:rPr>
+              <w:t xml:space="preserve">—</w:t>
+            </w:r>
+          </w:p>
+        </w:tc>
+        <w:tc>
+          <w:p>
+            <w:pPr>
+              <w:jc w:val="left"/>
+            </w:pPr>
+            <w:r>
+              <w:rPr>
+                <w:color w:val="000000"/>
+                <w:rtl w:val="false"/>
+              </w:rPr>
+              <w:t xml:space="preserve">PK, autoIncrement</w:t>
+            </w:r>
+          </w:p>
+        </w:tc>
+      </w:tr>
+      <w:tr>
+        <w:tc>
+          <w:p>
+            <w:pPr>
+              <w:jc w:val="left"/>
+            </w:pPr>
+            <w:r>
+              <w:rPr>
+                <w:color w:val="000000"/>
+                <w:rtl w:val="false"/>
+              </w:rPr>
+              <w:t xml:space="preserve">categoryId</w:t>
+            </w:r>
+          </w:p>
+        </w:tc>
+        <w:tc>
+          <w:p>
+            <w:pPr>
+              <w:jc w:val="left"/>
+            </w:pPr>
+            <w:r>
+              <w:rPr>
+                <w:color w:val="000000"/>
+                <w:rtl w:val="false"/>
+              </w:rPr>
+              <w:t xml:space="preserve">INTEGER</w:t>
+            </w:r>
+          </w:p>
+        </w:tc>
+        <w:tc>
+          <w:p>
+            <w:pPr>
+              <w:jc w:val="left"/>
+            </w:pPr>
+            <w:r>
+              <w:rPr>
+                <w:color w:val="000000"/>
+                <w:rtl w:val="false"/>
+              </w:rPr>
+              <w:t xml:space="preserve">No</w:t>
+            </w:r>
+          </w:p>
+        </w:tc>
+        <w:tc>
+          <w:p>
+            <w:pPr>
+              <w:jc w:val="left"/>
+            </w:pPr>
+            <w:r>
+              <w:rPr>
+                <w:color w:val="000000"/>
+                <w:rtl w:val="false"/>
+              </w:rPr>
+              <w:t xml:space="preserve">—</w:t>
+            </w:r>
+          </w:p>
+        </w:tc>
+        <w:tc>
+          <w:p>
+            <w:pPr>
+              <w:jc w:val="left"/>
+            </w:pPr>
+            <w:r>
+              <w:rPr>
+                <w:color w:val="000000"/>
+                <w:rtl w:val="false"/>
+              </w:rPr>
+              <w:t xml:space="preserve">FK → category.id</w:t>
+            </w:r>
+          </w:p>
+        </w:tc>
+      </w:tr>
+      <w:tr>
+        <w:tc>
+          <w:p>
+            <w:pPr>
+              <w:jc w:val="left"/>
+            </w:pPr>
+            <w:r>
+              <w:rPr>
+                <w:color w:val="000000"/>
+                <w:rtl w:val="false"/>
+              </w:rPr>
+              <w:t xml:space="preserve">customerId</w:t>
+            </w:r>
+          </w:p>
+        </w:tc>
+        <w:tc>
+          <w:p>
+            <w:pPr>
+              <w:jc w:val="left"/>
+            </w:pPr>
+            <w:r>
+              <w:rPr>
+                <w:color w:val="000000"/>
+                <w:rtl w:val="false"/>
+              </w:rPr>
+              <w:t xml:space="preserve">INTEGER</w:t>
+            </w:r>
+          </w:p>
+        </w:tc>
+        <w:tc>
+          <w:p>
+            <w:pPr>
+              <w:jc w:val="left"/>
+            </w:pPr>
+            <w:r>
+              <w:rPr>
+                <w:color w:val="000000"/>
+                <w:rtl w:val="false"/>
+              </w:rPr>
+              <w:t xml:space="preserve">No</w:t>
+            </w:r>
+          </w:p>
+        </w:tc>
+        <w:tc>
+          <w:p>
+            <w:pPr>
+              <w:jc w:val="left"/>
+            </w:pPr>
+            <w:r>
+              <w:rPr>
+                <w:color w:val="000000"/>
+                <w:rtl w:val="false"/>
+              </w:rPr>
+              <w:t xml:space="preserve">—</w:t>
+            </w:r>
+          </w:p>
+        </w:tc>
+        <w:tc>
+          <w:p>
+            <w:pPr>
+              <w:jc w:val="left"/>
+            </w:pPr>
+            <w:r>
+              <w:rPr>
+                <w:color w:val="000000"/>
+                <w:rtl w:val="false"/>
+              </w:rPr>
+              <w:t xml:space="preserve">FK → customer.id</w:t>
+            </w:r>
+          </w:p>
+        </w:tc>
+      </w:tr>
+      <w:tr>
+        <w:tc>
+          <w:p>
+            <w:pPr>
+              <w:jc w:val="left"/>
+            </w:pPr>
+            <w:r>
+              <w:rPr>
+                <w:color w:val="000000"/>
+                <w:rtl w:val="false"/>
+              </w:rPr>
+              <w:t xml:space="preserve">name</w:t>
+            </w:r>
+          </w:p>
+        </w:tc>
+        <w:tc>
+          <w:p>
+            <w:pPr>
+              <w:jc w:val="left"/>
+            </w:pPr>
+            <w:r>
+              <w:rPr>
+                <w:color w:val="000000"/>
+                <w:rtl w:val="false"/>
+              </w:rPr>
+              <w:t xml:space="preserve">STRING</w:t>
+            </w:r>
+          </w:p>
+        </w:tc>
+        <w:tc>
+          <w:p>
+            <w:pPr>
+              <w:jc w:val="left"/>
+            </w:pPr>
+            <w:r>
+              <w:rPr>
+                <w:color w:val="000000"/>
+                <w:rtl w:val="false"/>
+              </w:rPr>
+              <w:t xml:space="preserve">No</w:t>
+            </w:r>
+          </w:p>
+        </w:tc>
+        <w:tc>
+          <w:p>
+            <w:pPr>
+              <w:jc w:val="left"/>
+            </w:pPr>
+            <w:r>
+              <w:rPr>
+                <w:color w:val="000000"/>
+                <w:rtl w:val="false"/>
+              </w:rPr>
+              <w:t xml:space="preserve">—</w:t>
+            </w:r>
+          </w:p>
+        </w:tc>
+        <w:tc>
+          <w:p>
+            <w:pPr>
+              <w:jc w:val="left"/>
+            </w:pPr>
+            <w:r>
+              <w:rPr>
+                <w:color w:val="000000"/>
+                <w:rtl w:val="false"/>
+              </w:rPr>
+              <w:t xml:space="preserve"/>
+            </w:r>
+          </w:p>
+        </w:tc>
+      </w:tr>
+      <w:tr>
+        <w:tc>
+          <w:p>
+            <w:pPr>
+              <w:jc w:val="left"/>
+            </w:pPr>
+            <w:r>
+              <w:rPr>
+                <w:color w:val="000000"/>
+                <w:rtl w:val="false"/>
+              </w:rPr>
+              <w:t xml:space="preserve">contactNumber</w:t>
+            </w:r>
+          </w:p>
+        </w:tc>
+        <w:tc>
+          <w:p>
+            <w:pPr>
+              <w:jc w:val="left"/>
+            </w:pPr>
+            <w:r>
+              <w:rPr>
+                <w:color w:val="000000"/>
+                <w:rtl w:val="false"/>
+              </w:rPr>
+              <w:t xml:space="preserve">INTEGER</w:t>
+            </w:r>
+          </w:p>
+        </w:tc>
+        <w:tc>
+          <w:p>
+            <w:pPr>
+              <w:jc w:val="left"/>
+            </w:pPr>
+            <w:r>
+              <w:rPr>
+                <w:color w:val="000000"/>
+                <w:rtl w:val="false"/>
+              </w:rPr>
+              <w:t xml:space="preserve">Yes</w:t>
+            </w:r>
+          </w:p>
+        </w:tc>
+        <w:tc>
+          <w:p>
+            <w:pPr>
+              <w:jc w:val="left"/>
+            </w:pPr>
+            <w:r>
+              <w:rPr>
+                <w:color w:val="000000"/>
+                <w:rtl w:val="false"/>
+              </w:rPr>
+              <w:t xml:space="preserve">—</w:t>
+            </w:r>
+          </w:p>
+        </w:tc>
+        <w:tc>
+          <w:p>
+            <w:pPr>
+              <w:jc w:val="left"/>
+            </w:pPr>
+            <w:r>
+              <w:rPr>
+                <w:color w:val="000000"/>
+                <w:rtl w:val="false"/>
+              </w:rPr>
+              <w:t xml:space="preserve"/>
+            </w:r>
+          </w:p>
+        </w:tc>
+      </w:tr>
+      <w:tr>
+        <w:tc>
+          <w:p>
+            <w:pPr>
+              <w:jc w:val="left"/>
+            </w:pPr>
+            <w:r>
+              <w:rPr>
+                <w:color w:val="000000"/>
+                <w:rtl w:val="false"/>
+              </w:rPr>
+              <w:t xml:space="preserve">address</w:t>
+            </w:r>
+          </w:p>
+        </w:tc>
+        <w:tc>
+          <w:p>
+            <w:pPr>
+              <w:jc w:val="left"/>
+            </w:pPr>
+            <w:r>
+              <w:rPr>
+                <w:color w:val="000000"/>
+                <w:rtl w:val="false"/>
+              </w:rPr>
+              <w:t xml:space="preserve">STRING</w:t>
+            </w:r>
+          </w:p>
+        </w:tc>
+        <w:tc>
+          <w:p>
+            <w:pPr>
+              <w:jc w:val="left"/>
+            </w:pPr>
+            <w:r>
+              <w:rPr>
+                <w:color w:val="000000"/>
+                <w:rtl w:val="false"/>
+              </w:rPr>
+              <w:t xml:space="preserve">No</w:t>
+            </w:r>
+          </w:p>
+        </w:tc>
+        <w:tc>
+          <w:p>
+            <w:pPr>
+              <w:jc w:val="left"/>
+            </w:pPr>
+            <w:r>
+              <w:rPr>
+                <w:color w:val="000000"/>
+                <w:rtl w:val="false"/>
+              </w:rPr>
+              <w:t xml:space="preserve">—</w:t>
+            </w:r>
+          </w:p>
+        </w:tc>
+        <w:tc>
+          <w:p>
+            <w:pPr>
+              <w:jc w:val="left"/>
+            </w:pPr>
+            <w:r>
+              <w:rPr>
+                <w:color w:val="000000"/>
+                <w:rtl w:val="false"/>
+              </w:rPr>
+              <w:t xml:space="preserve"/>
+            </w:r>
+          </w:p>
+        </w:tc>
+      </w:tr>
+      <w:tr>
+        <w:tc>
+          <w:p>
+            <w:pPr>
+              <w:jc w:val="left"/>
+            </w:pPr>
+            <w:r>
+              <w:rPr>
+                <w:color w:val="000000"/>
+                <w:rtl w:val="false"/>
+              </w:rPr>
+              <w:t xml:space="preserve">sentDate</w:t>
+            </w:r>
+          </w:p>
+        </w:tc>
+        <w:tc>
+          <w:p>
+            <w:pPr>
+              <w:jc w:val="left"/>
+            </w:pPr>
+            <w:r>
+              <w:rPr>
+                <w:color w:val="000000"/>
+                <w:rtl w:val="false"/>
+              </w:rPr>
+              <w:t xml:space="preserve">DATEONLY</w:t>
+            </w:r>
+          </w:p>
+        </w:tc>
+        <w:tc>
+          <w:p>
+            <w:pPr>
+              <w:jc w:val="left"/>
+            </w:pPr>
+            <w:r>
+              <w:rPr>
+                <w:color w:val="000000"/>
+                <w:rtl w:val="false"/>
+              </w:rPr>
+              <w:t xml:space="preserve">Yes</w:t>
+            </w:r>
+          </w:p>
+        </w:tc>
+        <w:tc>
+          <w:p>
+            <w:pPr>
+              <w:jc w:val="left"/>
+            </w:pPr>
+            <w:r>
+              <w:rPr>
+                <w:color w:val="000000"/>
+                <w:rtl w:val="false"/>
+              </w:rPr>
+              <w:t xml:space="preserve">—</w:t>
+            </w:r>
+          </w:p>
+        </w:tc>
+        <w:tc>
+          <w:p>
+            <w:pPr>
+              <w:jc w:val="left"/>
+            </w:pPr>
+            <w:r>
+              <w:rPr>
+                <w:color w:val="000000"/>
+                <w:rtl w:val="false"/>
+              </w:rPr>
+              <w:t xml:space="preserve"/>
+            </w:r>
+          </w:p>
+        </w:tc>
+      </w:tr>
+      <w:tr>
+        <w:tc>
+          <w:p>
+            <w:pPr>
+              <w:jc w:val="left"/>
+            </w:pPr>
+            <w:r>
+              <w:rPr>
+                <w:color w:val="000000"/>
+                <w:rtl w:val="false"/>
+              </w:rPr>
+              <w:t xml:space="preserve">receivedDate</w:t>
+            </w:r>
+          </w:p>
+        </w:tc>
+        <w:tc>
+          <w:p>
+            <w:pPr>
+              <w:jc w:val="left"/>
+            </w:pPr>
+            <w:r>
+              <w:rPr>
+                <w:color w:val="000000"/>
+                <w:rtl w:val="false"/>
+              </w:rPr>
+              <w:t xml:space="preserve">DATEONLY</w:t>
+            </w:r>
+          </w:p>
+        </w:tc>
+        <w:tc>
+          <w:p>
+            <w:pPr>
+              <w:jc w:val="left"/>
+            </w:pPr>
+            <w:r>
+              <w:rPr>
+                <w:color w:val="000000"/>
+                <w:rtl w:val="false"/>
+              </w:rPr>
+              <w:t xml:space="preserve">Yes</w:t>
+            </w:r>
+          </w:p>
+        </w:tc>
+        <w:tc>
+          <w:p>
+            <w:pPr>
+              <w:jc w:val="left"/>
+            </w:pPr>
+            <w:r>
+              <w:rPr>
+                <w:color w:val="000000"/>
+                <w:rtl w:val="false"/>
+              </w:rPr>
+              <w:t xml:space="preserve">—</w:t>
+            </w:r>
+          </w:p>
+        </w:tc>
+        <w:tc>
+          <w:p>
+            <w:pPr>
+              <w:jc w:val="left"/>
+            </w:pPr>
+            <w:r>
+              <w:rPr>
+                <w:color w:val="000000"/>
+                <w:rtl w:val="false"/>
+              </w:rPr>
+              <w:t xml:space="preserve"/>
+            </w:r>
+          </w:p>
+        </w:tc>
+      </w:tr>
+      <w:tr>
+        <w:tc>
+          <w:p>
+            <w:pPr>
+              <w:jc w:val="left"/>
+            </w:pPr>
+            <w:r>
+              <w:rPr>
+                <w:color w:val="000000"/>
+                <w:rtl w:val="false"/>
+              </w:rPr>
+              <w:t xml:space="preserve">receivername</w:t>
+            </w:r>
+          </w:p>
+        </w:tc>
+        <w:tc>
+          <w:p>
+            <w:pPr>
+              <w:jc w:val="left"/>
+            </w:pPr>
+            <w:r>
+              <w:rPr>
+                <w:color w:val="000000"/>
+                <w:rtl w:val="false"/>
+              </w:rPr>
+              <w:t xml:space="preserve">STRING</w:t>
+            </w:r>
+          </w:p>
+        </w:tc>
+        <w:tc>
+          <w:p>
+            <w:pPr>
+              <w:jc w:val="left"/>
+            </w:pPr>
+            <w:r>
+              <w:rPr>
+                <w:color w:val="000000"/>
+                <w:rtl w:val="false"/>
+              </w:rPr>
+              <w:t xml:space="preserve">Yes</w:t>
+            </w:r>
+          </w:p>
+        </w:tc>
+        <w:tc>
+          <w:p>
+            <w:pPr>
+              <w:jc w:val="left"/>
+            </w:pPr>
+            <w:r>
+              <w:rPr>
+                <w:color w:val="000000"/>
+                <w:rtl w:val="false"/>
+              </w:rPr>
+              <w:t xml:space="preserve">—</w:t>
+            </w:r>
+          </w:p>
+        </w:tc>
+        <w:tc>
+          <w:p>
+            <w:pPr>
+              <w:jc w:val="left"/>
+            </w:pPr>
+            <w:r>
+              <w:rPr>
+                <w:color w:val="000000"/>
+                <w:rtl w:val="false"/>
+              </w:rPr>
+              <w:t xml:space="preserve">set via /courier/received</w:t>
+            </w:r>
+          </w:p>
+        </w:tc>
+      </w:tr>
+      <w:tr>
+        <w:tc>
+          <w:p>
+            <w:pPr>
+              <w:jc w:val="left"/>
+            </w:pPr>
+            <w:r>
+              <w:rPr>
+                <w:color w:val="000000"/>
+                <w:rtl w:val="false"/>
+              </w:rPr>
+              <w:t xml:space="preserve">nic</w:t>
+            </w:r>
+          </w:p>
+        </w:tc>
+        <w:tc>
+          <w:p>
+            <w:pPr>
+              <w:jc w:val="left"/>
+            </w:pPr>
+            <w:r>
+              <w:rPr>
+                <w:color w:val="000000"/>
+                <w:rtl w:val="false"/>
+              </w:rPr>
+              <w:t xml:space="preserve">STRING</w:t>
+            </w:r>
+          </w:p>
+        </w:tc>
+        <w:tc>
+          <w:p>
+            <w:pPr>
+              <w:jc w:val="left"/>
+            </w:pPr>
+            <w:r>
+              <w:rPr>
+                <w:color w:val="000000"/>
+                <w:rtl w:val="false"/>
+              </w:rPr>
+              <w:t xml:space="preserve">Yes</w:t>
+            </w:r>
+          </w:p>
+        </w:tc>
+        <w:tc>
+          <w:p>
+            <w:pPr>
+              <w:jc w:val="left"/>
+            </w:pPr>
+            <w:r>
+              <w:rPr>
+                <w:color w:val="000000"/>
+                <w:rtl w:val="false"/>
+              </w:rPr>
+              <w:t xml:space="preserve">—</w:t>
+            </w:r>
+          </w:p>
+        </w:tc>
+        <w:tc>
+          <w:p>
+            <w:pPr>
+              <w:jc w:val="left"/>
+            </w:pPr>
+            <w:r>
+              <w:rPr>
+                <w:color w:val="000000"/>
+                <w:rtl w:val="false"/>
+              </w:rPr>
+              <w:t xml:space="preserve">set via /courier/received</w:t>
+            </w:r>
+          </w:p>
+        </w:tc>
+      </w:tr>
+      <w:tr>
+        <w:tc>
+          <w:p>
+            <w:pPr>
+              <w:jc w:val="left"/>
+            </w:pPr>
+            <w:r>
+              <w:rPr>
+                <w:color w:val="000000"/>
+                <w:rtl w:val="false"/>
+              </w:rPr>
+              <w:t xml:space="preserve">isActive</w:t>
+            </w:r>
+          </w:p>
+        </w:tc>
+        <w:tc>
+          <w:p>
+            <w:pPr>
+              <w:jc w:val="left"/>
+            </w:pPr>
+            <w:r>
+              <w:rPr>
+                <w:color w:val="000000"/>
+                <w:rtl w:val="false"/>
+              </w:rPr>
+              <w:t xml:space="preserve">BOOLEAN</w:t>
+            </w:r>
+          </w:p>
+        </w:tc>
+        <w:tc>
+          <w:p>
+            <w:pPr>
+              <w:jc w:val="left"/>
+            </w:pPr>
+            <w:r>
+              <w:rPr>
+                <w:color w:val="000000"/>
+                <w:rtl w:val="false"/>
+              </w:rPr>
+              <w:t xml:space="preserve">Yes</w:t>
+            </w:r>
+          </w:p>
+        </w:tc>
+        <w:tc>
+          <w:p>
+            <w:pPr>
+              <w:jc w:val="left"/>
+            </w:pPr>
+            <w:r>
+              <w:rPr>
+                <w:color w:val="000000"/>
+                <w:rtl w:val="false"/>
+              </w:rPr>
+              <w:t xml:space="preserve">true</w:t>
+            </w:r>
+          </w:p>
+        </w:tc>
+        <w:tc>
+          <w:p>
+            <w:pPr>
+              <w:jc w:val="left"/>
+            </w:pPr>
+            <w:r>
+              <w:rPr>
+                <w:color w:val="000000"/>
+                <w:rtl w:val="false"/>
+              </w:rPr>
+              <w:t xml:space="preserve"/>
+            </w:r>
+          </w:p>
+        </w:tc>
+      </w:tr>
+    </w:tbl>
+    <w:p>
+      <w:pPr>
+        <w:bidi w:val="false"/>
+        <w:spacing w:before="240" w:after="240" w:line="276"/>
+        <w:jc w:val="left"/>
+      </w:pPr>
+      <w:r>
+        <w:rPr>
+          <w:b/>
+          <w:bCs/>
+          <w:i w:val="false"/>
+          <w:iCs w:val="false"/>
+          <w:color w:val="000000"/>
+          <w:sz w:val="24"/>
+          <w:szCs w:val="24"/>
+          <w:rtl w:val="false"/>
+        </w:rPr>
+        <w:t xml:space="preserve">Model file:</w:t>
+      </w:r>
+      <w:r>
+        <w:rPr>
+          <w:b w:val="false"/>
+          <w:bCs w:val="false"/>
+          <w:i w:val="false"/>
+          <w:iCs w:val="false"/>
+          <w:color w:val="000000"/>
+          <w:sz w:val="24"/>
+          <w:szCs w:val="24"/>
+          <w:rtl w:val="false"/>
+        </w:rPr>
+        <w:t xml:space="preserve"> </w:t>
+      </w:r>
+      <w:r>
+        <w:rPr>
+          <w:rFonts w:ascii="Courier New" w:cs="Courier New" w:eastAsia="Courier New" w:hAnsi="Courier New"/>
+          <w:color w:val="444444"/>
+          <w:sz w:val="20"/>
+          <w:szCs w:val="20"/>
+          <w:shd w:fill="F5F5F5"/>
+          <w:rtl w:val="false"/>
+        </w:rPr>
+        <w:t xml:space="preserve">models/Courier.js</w:t>
+      </w:r>
+    </w:p>
+    <w:p>
+      <w:pPr>
+        <w:pStyle w:val="2"/>
+        <w:pStyle w:val="Heading2"/>
+        <w:bidi w:val="false"/>
+        <w:spacing w:before="240" w:after="120"/>
+      </w:pPr>
+      <w:bookmarkStart w:name="_Toc__15_Transfer_transfer_1771840706577" w:id="1"/>
+      <w:r>
+        <w:rPr>
+          <w:b w:val="false"/>
+          <w:bCs w:val="false"/>
+          <w:i w:val="false"/>
+          <w:iCs w:val="false"/>
+          <w:color w:val="000000"/>
+          <w:sz w:val="28"/>
+          <w:szCs w:val="28"/>
+          <w:rtl w:val="false"/>
+        </w:rPr>
+        <w:t xml:space="preserve">15. Transfer (`transfer`)</w:t>
+      </w:r>
+      <w:bookmarkEnd w:id="1"/>
+    </w:p>
+    <w:tbl>
+      <w:tblPr>
+        <w:tblW w:type="pct" w:w="100%"/>
+        <w:tblBorders>
+          <w:top w:val="single" w:color="auto" w:sz="4"/>
+          <w:left w:val="single" w:color="auto" w:sz="4"/>
+          <w:bottom w:val="single" w:color="auto" w:sz="4"/>
+          <w:right w:val="single" w:color="auto" w:sz="4"/>
+          <w:insideH w:val="single" w:color="auto" w:sz="4"/>
+          <w:insideV w:val="single" w:color="auto" w:sz="4"/>
+        </w:tblBorders>
+        <w:tblLayout w:type="autofit"/>
+        <w:tblCellMar>
+          <w:top w:type="dxa" w:w="100"/>
+          <w:left w:type="dxa" w:w="100"/>
+          <w:bottom w:type="dxa" w:w="100"/>
+          <w:right w:type="dxa" w:w="100"/>
+        </w:tblCellMar>
+      </w:tblPr>
+      <w:tblGrid>
+        <w:gridCol w:w="100"/>
+        <w:gridCol w:w="100"/>
+        <w:gridCol w:w="100"/>
+        <w:gridCol w:w="100"/>
+        <w:gridCol w:w="100"/>
+      </w:tblGrid>
+      <w:tr>
+        <w:trPr>
+          <w:tblHeader/>
+        </w:trPr>
+        <w:tc>
+          <w:tcPr>
+            <w:shd w:fill="F2F2F2"/>
+          </w:tcPr>
+          <w:p>
+            <w:pPr>
+              <w:pStyle w:val="Strong"/>
+              <w:jc w:val="left"/>
+            </w:pPr>
+            <w:r>
+              <w:rPr>
+                <w:b/>
+                <w:bCs/>
+                <w:color w:val="000000"/>
+              </w:rPr>
+              <w:t xml:space="preserve">Column</w:t>
+            </w:r>
+          </w:p>
+        </w:tc>
+        <w:tc>
+          <w:tcPr>
+            <w:shd w:fill="F2F2F2"/>
+          </w:tcPr>
+          <w:p>
+            <w:pPr>
+              <w:pStyle w:val="Strong"/>
+              <w:jc w:val="left"/>
+            </w:pPr>
+            <w:r>
+              <w:rPr>
+                <w:b/>
+                <w:bCs/>
+                <w:color w:val="000000"/>
+              </w:rPr>
+              <w:t xml:space="preserve">Type</w:t>
+            </w:r>
+          </w:p>
+        </w:tc>
+        <w:tc>
+          <w:tcPr>
+            <w:shd w:fill="F2F2F2"/>
+          </w:tcPr>
+          <w:p>
+            <w:pPr>
+              <w:pStyle w:val="Strong"/>
+              <w:jc w:val="left"/>
+            </w:pPr>
+            <w:r>
+              <w:rPr>
+                <w:b/>
+                <w:bCs/>
+                <w:color w:val="000000"/>
+              </w:rPr>
+              <w:t xml:space="preserve">Null</w:t>
+            </w:r>
+          </w:p>
+        </w:tc>
+        <w:tc>
+          <w:tcPr>
+            <w:shd w:fill="F2F2F2"/>
+          </w:tcPr>
+          <w:p>
+            <w:pPr>
+              <w:pStyle w:val="Strong"/>
+              <w:jc w:val="left"/>
+            </w:pPr>
+            <w:r>
+              <w:rPr>
+                <w:b/>
+                <w:bCs/>
+                <w:color w:val="000000"/>
+              </w:rPr>
+              <w:t xml:space="preserve">Default</w:t>
+            </w:r>
+          </w:p>
+        </w:tc>
+        <w:tc>
+          <w:tcPr>
+            <w:shd w:fill="F2F2F2"/>
+          </w:tcPr>
+          <w:p>
+            <w:pPr>
+              <w:pStyle w:val="Strong"/>
+              <w:jc w:val="left"/>
+            </w:pPr>
+            <w:r>
+              <w:rPr>
+                <w:b/>
+                <w:bCs/>
+                <w:color w:val="000000"/>
+              </w:rPr>
+              <w:t xml:space="preserve">Notes</w:t>
+            </w:r>
+          </w:p>
+        </w:tc>
+      </w:tr>
+      <w:tr>
+        <w:tc>
+          <w:p>
+            <w:pPr>
+              <w:jc w:val="left"/>
+            </w:pPr>
+            <w:r>
+              <w:rPr>
+                <w:color w:val="000000"/>
+                <w:rtl w:val="false"/>
+              </w:rPr>
+              <w:t xml:space="preserve">id</w:t>
+            </w:r>
+          </w:p>
+        </w:tc>
+        <w:tc>
+          <w:p>
+            <w:pPr>
+              <w:jc w:val="left"/>
+            </w:pPr>
+            <w:r>
+              <w:rPr>
+                <w:color w:val="000000"/>
+                <w:rtl w:val="false"/>
+              </w:rPr>
+              <w:t xml:space="preserve">INTEGER</w:t>
+            </w:r>
+          </w:p>
+        </w:tc>
+        <w:tc>
+          <w:p>
+            <w:pPr>
+              <w:jc w:val="left"/>
+            </w:pPr>
+            <w:r>
+              <w:rPr>
+                <w:color w:val="000000"/>
+                <w:rtl w:val="false"/>
+              </w:rPr>
+              <w:t xml:space="preserve">No</w:t>
+            </w:r>
+          </w:p>
+        </w:tc>
+        <w:tc>
+          <w:p>
+            <w:pPr>
+              <w:jc w:val="left"/>
+            </w:pPr>
+            <w:r>
+              <w:rPr>
+                <w:color w:val="000000"/>
+                <w:rtl w:val="false"/>
+              </w:rPr>
+              <w:t xml:space="preserve">—</w:t>
+            </w:r>
+          </w:p>
+        </w:tc>
+        <w:tc>
+          <w:p>
+            <w:pPr>
+              <w:jc w:val="left"/>
+            </w:pPr>
+            <w:r>
+              <w:rPr>
+                <w:color w:val="000000"/>
+                <w:rtl w:val="false"/>
+              </w:rPr>
+              <w:t xml:space="preserve">PK, autoIncrement</w:t>
+            </w:r>
+          </w:p>
+        </w:tc>
+      </w:tr>
+      <w:tr>
+        <w:tc>
+          <w:p>
+            <w:pPr>
+              <w:jc w:val="left"/>
+            </w:pPr>
+            <w:r>
+              <w:rPr>
+                <w:color w:val="000000"/>
+                <w:rtl w:val="false"/>
+              </w:rPr>
+              <w:t xml:space="preserve">stockId</w:t>
+            </w:r>
+          </w:p>
+        </w:tc>
+        <w:tc>
+          <w:p>
+            <w:pPr>
+              <w:jc w:val="left"/>
+            </w:pPr>
+            <w:r>
+              <w:rPr>
+                <w:color w:val="000000"/>
+                <w:rtl w:val="false"/>
+              </w:rPr>
+              <w:t xml:space="preserve">INTEGER</w:t>
+            </w:r>
+          </w:p>
+        </w:tc>
+        <w:tc>
+          <w:p>
+            <w:pPr>
+              <w:jc w:val="left"/>
+            </w:pPr>
+            <w:r>
+              <w:rPr>
+                <w:color w:val="000000"/>
+                <w:rtl w:val="false"/>
+              </w:rPr>
+              <w:t xml:space="preserve">No</w:t>
+            </w:r>
+          </w:p>
+        </w:tc>
+        <w:tc>
+          <w:p>
+            <w:pPr>
+              <w:jc w:val="left"/>
+            </w:pPr>
+            <w:r>
+              <w:rPr>
+                <w:color w:val="000000"/>
+                <w:rtl w:val="false"/>
+              </w:rPr>
+              <w:t xml:space="preserve">—</w:t>
+            </w:r>
+          </w:p>
+        </w:tc>
+        <w:tc>
+          <w:p>
+            <w:pPr>
+              <w:jc w:val="left"/>
+            </w:pPr>
+            <w:r>
+              <w:rPr>
+                <w:color w:val="000000"/>
+                <w:rtl w:val="false"/>
+              </w:rPr>
+              <w:t xml:space="preserve">FK → stock.id</w:t>
+            </w:r>
+          </w:p>
+        </w:tc>
+      </w:tr>
+      <w:tr>
+        <w:tc>
+          <w:p>
+            <w:pPr>
+              <w:jc w:val="left"/>
+            </w:pPr>
+            <w:r>
+              <w:rPr>
+                <w:color w:val="000000"/>
+                <w:rtl w:val="false"/>
+              </w:rPr>
+              <w:t xml:space="preserve">userId</w:t>
+            </w:r>
+          </w:p>
+        </w:tc>
+        <w:tc>
+          <w:p>
+            <w:pPr>
+              <w:jc w:val="left"/>
+            </w:pPr>
+            <w:r>
+              <w:rPr>
+                <w:color w:val="000000"/>
+                <w:rtl w:val="false"/>
+              </w:rPr>
+              <w:t xml:space="preserve">INTEGER</w:t>
+            </w:r>
+          </w:p>
+        </w:tc>
+        <w:tc>
+          <w:p>
+            <w:pPr>
+              <w:jc w:val="left"/>
+            </w:pPr>
+            <w:r>
+              <w:rPr>
+                <w:color w:val="000000"/>
+                <w:rtl w:val="false"/>
+              </w:rPr>
+              <w:t xml:space="preserve">No</w:t>
+            </w:r>
+          </w:p>
+        </w:tc>
+        <w:tc>
+          <w:p>
+            <w:pPr>
+              <w:jc w:val="left"/>
+            </w:pPr>
+            <w:r>
+              <w:rPr>
+                <w:color w:val="000000"/>
+                <w:rtl w:val="false"/>
+              </w:rPr>
+              <w:t xml:space="preserve">—</w:t>
+            </w:r>
+          </w:p>
+        </w:tc>
+        <w:tc>
+          <w:p>
+            <w:pPr>
+              <w:jc w:val="left"/>
+            </w:pPr>
+            <w:r>
+              <w:rPr>
+                <w:color w:val="000000"/>
+                <w:rtl w:val="false"/>
+              </w:rPr>
+              <w:t xml:space="preserve">FK → user.id</w:t>
+            </w:r>
+          </w:p>
+        </w:tc>
+      </w:tr>
+      <w:tr>
+        <w:tc>
+          <w:p>
+            <w:pPr>
+              <w:jc w:val="left"/>
+            </w:pPr>
+            <w:r>
+              <w:rPr>
+                <w:color w:val="000000"/>
+                <w:rtl w:val="false"/>
+              </w:rPr>
+              <w:t xml:space="preserve">quantity</w:t>
+            </w:r>
+          </w:p>
+        </w:tc>
+        <w:tc>
+          <w:p>
+            <w:pPr>
+              <w:jc w:val="left"/>
+            </w:pPr>
+            <w:r>
+              <w:rPr>
+                <w:color w:val="000000"/>
+                <w:rtl w:val="false"/>
+              </w:rPr>
+              <w:t xml:space="preserve">INTEGER</w:t>
+            </w:r>
+          </w:p>
+        </w:tc>
+        <w:tc>
+          <w:p>
+            <w:pPr>
+              <w:jc w:val="left"/>
+            </w:pPr>
+            <w:r>
+              <w:rPr>
+                <w:color w:val="000000"/>
+                <w:rtl w:val="false"/>
+              </w:rPr>
+              <w:t xml:space="preserve">Yes</w:t>
+            </w:r>
+          </w:p>
+        </w:tc>
+        <w:tc>
+          <w:p>
+            <w:pPr>
+              <w:jc w:val="left"/>
+            </w:pPr>
+            <w:r>
+              <w:rPr>
+                <w:color w:val="000000"/>
+                <w:rtl w:val="false"/>
+              </w:rPr>
+              <w:t xml:space="preserve">—</w:t>
+            </w:r>
+          </w:p>
+        </w:tc>
+        <w:tc>
+          <w:p>
+            <w:pPr>
+              <w:jc w:val="left"/>
+            </w:pPr>
+            <w:r>
+              <w:rPr>
+                <w:color w:val="000000"/>
+                <w:rtl w:val="false"/>
+              </w:rPr>
+              <w:t xml:space="preserve"/>
+            </w:r>
+          </w:p>
+        </w:tc>
+      </w:tr>
+      <w:tr>
+        <w:tc>
+          <w:p>
+            <w:pPr>
+              <w:jc w:val="left"/>
+            </w:pPr>
+            <w:r>
+              <w:rPr>
+                <w:color w:val="000000"/>
+                <w:rtl w:val="false"/>
+              </w:rPr>
+              <w:t xml:space="preserve">companyName</w:t>
+            </w:r>
+          </w:p>
+        </w:tc>
+        <w:tc>
+          <w:p>
+            <w:pPr>
+              <w:jc w:val="left"/>
+            </w:pPr>
+            <w:r>
+              <w:rPr>
+                <w:color w:val="000000"/>
+                <w:rtl w:val="false"/>
+              </w:rPr>
+              <w:t xml:space="preserve">STRING</w:t>
+            </w:r>
+          </w:p>
+        </w:tc>
+        <w:tc>
+          <w:p>
+            <w:pPr>
+              <w:jc w:val="left"/>
+            </w:pPr>
+            <w:r>
+              <w:rPr>
+                <w:color w:val="000000"/>
+                <w:rtl w:val="false"/>
+              </w:rPr>
+              <w:t xml:space="preserve">No</w:t>
+            </w:r>
+          </w:p>
+        </w:tc>
+        <w:tc>
+          <w:p>
+            <w:pPr>
+              <w:jc w:val="left"/>
+            </w:pPr>
+            <w:r>
+              <w:rPr>
+                <w:color w:val="000000"/>
+                <w:rtl w:val="false"/>
+              </w:rPr>
+              <w:t xml:space="preserve">—</w:t>
+            </w:r>
+          </w:p>
+        </w:tc>
+        <w:tc>
+          <w:p>
+            <w:pPr>
+              <w:jc w:val="left"/>
+            </w:pPr>
+            <w:r>
+              <w:rPr>
+                <w:color w:val="000000"/>
+                <w:rtl w:val="false"/>
+              </w:rPr>
+              <w:t xml:space="preserve"/>
+            </w:r>
+          </w:p>
+        </w:tc>
+      </w:tr>
+      <w:tr>
+        <w:tc>
+          <w:p>
+            <w:pPr>
+              <w:jc w:val="left"/>
+            </w:pPr>
+            <w:r>
+              <w:rPr>
+                <w:color w:val="000000"/>
+                <w:rtl w:val="false"/>
+              </w:rPr>
+              <w:t xml:space="preserve">contactNumber</w:t>
+            </w:r>
+          </w:p>
+        </w:tc>
+        <w:tc>
+          <w:p>
+            <w:pPr>
+              <w:jc w:val="left"/>
+            </w:pPr>
+            <w:r>
+              <w:rPr>
+                <w:color w:val="000000"/>
+                <w:rtl w:val="false"/>
+              </w:rPr>
+              <w:t xml:space="preserve">INTEGER</w:t>
+            </w:r>
+          </w:p>
+        </w:tc>
+        <w:tc>
+          <w:p>
+            <w:pPr>
+              <w:jc w:val="left"/>
+            </w:pPr>
+            <w:r>
+              <w:rPr>
+                <w:color w:val="000000"/>
+                <w:rtl w:val="false"/>
+              </w:rPr>
+              <w:t xml:space="preserve">Yes</w:t>
+            </w:r>
+          </w:p>
+        </w:tc>
+        <w:tc>
+          <w:p>
+            <w:pPr>
+              <w:jc w:val="left"/>
+            </w:pPr>
+            <w:r>
+              <w:rPr>
+                <w:color w:val="000000"/>
+                <w:rtl w:val="false"/>
+              </w:rPr>
+              <w:t xml:space="preserve">—</w:t>
+            </w:r>
+          </w:p>
+        </w:tc>
+        <w:tc>
+          <w:p>
+            <w:pPr>
+              <w:jc w:val="left"/>
+            </w:pPr>
+            <w:r>
+              <w:rPr>
+                <w:color w:val="000000"/>
+                <w:rtl w:val="false"/>
+              </w:rPr>
+              <w:t xml:space="preserve"/>
+            </w:r>
+          </w:p>
+        </w:tc>
+      </w:tr>
+      <w:tr>
+        <w:tc>
+          <w:p>
+            <w:pPr>
+              <w:jc w:val="left"/>
+            </w:pPr>
+            <w:r>
+              <w:rPr>
+                <w:color w:val="000000"/>
+                <w:rtl w:val="false"/>
+              </w:rPr>
+              <w:t xml:space="preserve">address</w:t>
+            </w:r>
+          </w:p>
+        </w:tc>
+        <w:tc>
+          <w:p>
+            <w:pPr>
+              <w:jc w:val="left"/>
+            </w:pPr>
+            <w:r>
+              <w:rPr>
+                <w:color w:val="000000"/>
+                <w:rtl w:val="false"/>
+              </w:rPr>
+              <w:t xml:space="preserve">STRING</w:t>
+            </w:r>
+          </w:p>
+        </w:tc>
+        <w:tc>
+          <w:p>
+            <w:pPr>
+              <w:jc w:val="left"/>
+            </w:pPr>
+            <w:r>
+              <w:rPr>
+                <w:color w:val="000000"/>
+                <w:rtl w:val="false"/>
+              </w:rPr>
+              <w:t xml:space="preserve">No</w:t>
+            </w:r>
+          </w:p>
+        </w:tc>
+        <w:tc>
+          <w:p>
+            <w:pPr>
+              <w:jc w:val="left"/>
+            </w:pPr>
+            <w:r>
+              <w:rPr>
+                <w:color w:val="000000"/>
+                <w:rtl w:val="false"/>
+              </w:rPr>
+              <w:t xml:space="preserve">—</w:t>
+            </w:r>
+          </w:p>
+        </w:tc>
+        <w:tc>
+          <w:p>
+            <w:pPr>
+              <w:jc w:val="left"/>
+            </w:pPr>
+            <w:r>
+              <w:rPr>
+                <w:color w:val="000000"/>
+                <w:rtl w:val="false"/>
+              </w:rPr>
+              <w:t xml:space="preserve"/>
+            </w:r>
+          </w:p>
+        </w:tc>
+      </w:tr>
+      <w:tr>
+        <w:tc>
+          <w:p>
+            <w:pPr>
+              <w:jc w:val="left"/>
+            </w:pPr>
+            <w:r>
+              <w:rPr>
+                <w:color w:val="000000"/>
+                <w:rtl w:val="false"/>
+              </w:rPr>
+              <w:t xml:space="preserve">deliveryDetails</w:t>
+            </w:r>
+          </w:p>
+        </w:tc>
+        <w:tc>
+          <w:p>
+            <w:pPr>
+              <w:jc w:val="left"/>
+            </w:pPr>
+            <w:r>
+              <w:rPr>
+                <w:color w:val="000000"/>
+                <w:rtl w:val="false"/>
+              </w:rPr>
+              <w:t xml:space="preserve">STRING</w:t>
+            </w:r>
+          </w:p>
+        </w:tc>
+        <w:tc>
+          <w:p>
+            <w:pPr>
+              <w:jc w:val="left"/>
+            </w:pPr>
+            <w:r>
+              <w:rPr>
+                <w:color w:val="000000"/>
+                <w:rtl w:val="false"/>
+              </w:rPr>
+              <w:t xml:space="preserve">No</w:t>
+            </w:r>
+          </w:p>
+        </w:tc>
+        <w:tc>
+          <w:p>
+            <w:pPr>
+              <w:jc w:val="left"/>
+            </w:pPr>
+            <w:r>
+              <w:rPr>
+                <w:color w:val="000000"/>
+                <w:rtl w:val="false"/>
+              </w:rPr>
+              <w:t xml:space="preserve">—</w:t>
+            </w:r>
+          </w:p>
+        </w:tc>
+        <w:tc>
+          <w:p>
+            <w:pPr>
+              <w:jc w:val="left"/>
+            </w:pPr>
+            <w:r>
+              <w:rPr>
+                <w:color w:val="000000"/>
+                <w:rtl w:val="false"/>
+              </w:rPr>
+              <w:t xml:space="preserve"/>
+            </w:r>
+          </w:p>
+        </w:tc>
+      </w:tr>
+      <w:tr>
+        <w:tc>
+          <w:p>
+            <w:pPr>
+              <w:jc w:val="left"/>
+            </w:pPr>
+            <w:r>
+              <w:rPr>
+                <w:color w:val="000000"/>
+                <w:rtl w:val="false"/>
+              </w:rPr>
+              <w:t xml:space="preserve">isActive</w:t>
+            </w:r>
+          </w:p>
+        </w:tc>
+        <w:tc>
+          <w:p>
+            <w:pPr>
+              <w:jc w:val="left"/>
+            </w:pPr>
+            <w:r>
+              <w:rPr>
+                <w:color w:val="000000"/>
+                <w:rtl w:val="false"/>
+              </w:rPr>
+              <w:t xml:space="preserve">BOOLEAN</w:t>
+            </w:r>
+          </w:p>
+        </w:tc>
+        <w:tc>
+          <w:p>
+            <w:pPr>
+              <w:jc w:val="left"/>
+            </w:pPr>
+            <w:r>
+              <w:rPr>
+                <w:color w:val="000000"/>
+                <w:rtl w:val="false"/>
+              </w:rPr>
+              <w:t xml:space="preserve">Yes</w:t>
+            </w:r>
+          </w:p>
+        </w:tc>
+        <w:tc>
+          <w:p>
+            <w:pPr>
+              <w:jc w:val="left"/>
+            </w:pPr>
+            <w:r>
+              <w:rPr>
+                <w:color w:val="000000"/>
+                <w:rtl w:val="false"/>
+              </w:rPr>
+              <w:t xml:space="preserve">true</w:t>
+            </w:r>
+          </w:p>
+        </w:tc>
+        <w:tc>
+          <w:p>
+            <w:pPr>
+              <w:jc w:val="left"/>
+            </w:pPr>
+            <w:r>
+              <w:rPr>
+                <w:color w:val="000000"/>
+                <w:rtl w:val="false"/>
+              </w:rPr>
+              <w:t xml:space="preserve"/>
+            </w:r>
+          </w:p>
+        </w:tc>
+      </w:tr>
+    </w:tbl>
+    <w:p>
+      <w:pPr>
+        <w:bidi w:val="false"/>
+        <w:spacing w:before="240" w:after="240" w:line="276"/>
+        <w:jc w:val="left"/>
+      </w:pPr>
+      <w:r>
+        <w:rPr>
+          <w:b/>
+          <w:bCs/>
+          <w:i w:val="false"/>
+          <w:iCs w:val="false"/>
+          <w:color w:val="000000"/>
+          <w:sz w:val="24"/>
+          <w:szCs w:val="24"/>
+          <w:rtl w:val="false"/>
+        </w:rPr>
+        <w:t xml:space="preserve">Model file:</w:t>
+      </w:r>
+      <w:r>
+        <w:rPr>
+          <w:b w:val="false"/>
+          <w:bCs w:val="false"/>
+          <w:i w:val="false"/>
+          <w:iCs w:val="false"/>
+          <w:color w:val="000000"/>
+          <w:sz w:val="24"/>
+          <w:szCs w:val="24"/>
+          <w:rtl w:val="false"/>
+        </w:rPr>
+        <w:t xml:space="preserve"> </w:t>
+      </w:r>
+      <w:r>
+        <w:rPr>
+          <w:rFonts w:ascii="Courier New" w:cs="Courier New" w:eastAsia="Courier New" w:hAnsi="Courier New"/>
+          <w:color w:val="444444"/>
+          <w:sz w:val="20"/>
+          <w:szCs w:val="20"/>
+          <w:shd w:fill="F5F5F5"/>
+          <w:rtl w:val="false"/>
+        </w:rPr>
+        <w:t xml:space="preserve">models/Transfer.js</w:t>
+      </w:r>
+    </w:p>
+    <w:p>
+      <w:pPr>
+        <w:pStyle w:val="2"/>
+        <w:pStyle w:val="Heading2"/>
+        <w:bidi w:val="false"/>
+        <w:spacing w:before="240" w:after="120"/>
+      </w:pPr>
+      <w:bookmarkStart w:name="_Toc_Associations_from_modelsindexjs_1771840706577" w:id="1"/>
       <w:r>
         <w:rPr>
           <w:b w:val="false"/>
@@ -11732,6 +13560,470 @@
                 <w:rtl w:val="false"/>
               </w:rPr>
               <w:t xml:space="preserve">modelId</w:t>
+            </w:r>
+          </w:p>
+        </w:tc>
+      </w:tr>
+      <w:tr>
+        <w:tc>
+          <w:p>
+            <w:pPr>
+              <w:jc w:val="left"/>
+            </w:pPr>
+            <w:r>
+              <w:rPr>
+                <w:color w:val="000000"/>
+                <w:rtl w:val="false"/>
+              </w:rPr>
+              <w:t xml:space="preserve">Category</w:t>
+            </w:r>
+          </w:p>
+        </w:tc>
+        <w:tc>
+          <w:p>
+            <w:pPr>
+              <w:jc w:val="left"/>
+            </w:pPr>
+            <w:r>
+              <w:rPr>
+                <w:color w:val="000000"/>
+                <w:rtl w:val="false"/>
+              </w:rPr>
+              <w:t xml:space="preserve">Courier</w:t>
+            </w:r>
+          </w:p>
+        </w:tc>
+        <w:tc>
+          <w:p>
+            <w:pPr>
+              <w:jc w:val="left"/>
+            </w:pPr>
+            <w:r>
+              <w:rPr>
+                <w:color w:val="000000"/>
+                <w:rtl w:val="false"/>
+              </w:rPr>
+              <w:t xml:space="preserve">hasMany</w:t>
+            </w:r>
+          </w:p>
+        </w:tc>
+        <w:tc>
+          <w:p>
+            <w:pPr>
+              <w:jc w:val="left"/>
+            </w:pPr>
+            <w:r>
+              <w:rPr>
+                <w:color w:val="000000"/>
+                <w:rtl w:val="false"/>
+              </w:rPr>
+              <w:t xml:space="preserve">categoryId</w:t>
+            </w:r>
+          </w:p>
+        </w:tc>
+      </w:tr>
+      <w:tr>
+        <w:tc>
+          <w:p>
+            <w:pPr>
+              <w:jc w:val="left"/>
+            </w:pPr>
+            <w:r>
+              <w:rPr>
+                <w:color w:val="000000"/>
+                <w:rtl w:val="false"/>
+              </w:rPr>
+              <w:t xml:space="preserve">Courier</w:t>
+            </w:r>
+          </w:p>
+        </w:tc>
+        <w:tc>
+          <w:p>
+            <w:pPr>
+              <w:jc w:val="left"/>
+            </w:pPr>
+            <w:r>
+              <w:rPr>
+                <w:color w:val="000000"/>
+                <w:rtl w:val="false"/>
+              </w:rPr>
+              <w:t xml:space="preserve">Category</w:t>
+            </w:r>
+          </w:p>
+        </w:tc>
+        <w:tc>
+          <w:p>
+            <w:pPr>
+              <w:jc w:val="left"/>
+            </w:pPr>
+            <w:r>
+              <w:rPr>
+                <w:color w:val="000000"/>
+                <w:rtl w:val="false"/>
+              </w:rPr>
+              <w:t xml:space="preserve">belongsTo</w:t>
+            </w:r>
+          </w:p>
+        </w:tc>
+        <w:tc>
+          <w:p>
+            <w:pPr>
+              <w:jc w:val="left"/>
+            </w:pPr>
+            <w:r>
+              <w:rPr>
+                <w:color w:val="000000"/>
+                <w:rtl w:val="false"/>
+              </w:rPr>
+              <w:t xml:space="preserve">categoryId</w:t>
+            </w:r>
+          </w:p>
+        </w:tc>
+      </w:tr>
+      <w:tr>
+        <w:tc>
+          <w:p>
+            <w:pPr>
+              <w:jc w:val="left"/>
+            </w:pPr>
+            <w:r>
+              <w:rPr>
+                <w:color w:val="000000"/>
+                <w:rtl w:val="false"/>
+              </w:rPr>
+              <w:t xml:space="preserve">Customer</w:t>
+            </w:r>
+          </w:p>
+        </w:tc>
+        <w:tc>
+          <w:p>
+            <w:pPr>
+              <w:jc w:val="left"/>
+            </w:pPr>
+            <w:r>
+              <w:rPr>
+                <w:color w:val="000000"/>
+                <w:rtl w:val="false"/>
+              </w:rPr>
+              <w:t xml:space="preserve">Courier</w:t>
+            </w:r>
+          </w:p>
+        </w:tc>
+        <w:tc>
+          <w:p>
+            <w:pPr>
+              <w:jc w:val="left"/>
+            </w:pPr>
+            <w:r>
+              <w:rPr>
+                <w:color w:val="000000"/>
+                <w:rtl w:val="false"/>
+              </w:rPr>
+              <w:t xml:space="preserve">hasMany</w:t>
+            </w:r>
+          </w:p>
+        </w:tc>
+        <w:tc>
+          <w:p>
+            <w:pPr>
+              <w:jc w:val="left"/>
+            </w:pPr>
+            <w:r>
+              <w:rPr>
+                <w:color w:val="000000"/>
+                <w:rtl w:val="false"/>
+              </w:rPr>
+              <w:t xml:space="preserve">customerId</w:t>
+            </w:r>
+          </w:p>
+        </w:tc>
+      </w:tr>
+      <w:tr>
+        <w:tc>
+          <w:p>
+            <w:pPr>
+              <w:jc w:val="left"/>
+            </w:pPr>
+            <w:r>
+              <w:rPr>
+                <w:color w:val="000000"/>
+                <w:rtl w:val="false"/>
+              </w:rPr>
+              <w:t xml:space="preserve">Courier</w:t>
+            </w:r>
+          </w:p>
+        </w:tc>
+        <w:tc>
+          <w:p>
+            <w:pPr>
+              <w:jc w:val="left"/>
+            </w:pPr>
+            <w:r>
+              <w:rPr>
+                <w:color w:val="000000"/>
+                <w:rtl w:val="false"/>
+              </w:rPr>
+              <w:t xml:space="preserve">Customer</w:t>
+            </w:r>
+          </w:p>
+        </w:tc>
+        <w:tc>
+          <w:p>
+            <w:pPr>
+              <w:jc w:val="left"/>
+            </w:pPr>
+            <w:r>
+              <w:rPr>
+                <w:color w:val="000000"/>
+                <w:rtl w:val="false"/>
+              </w:rPr>
+              <w:t xml:space="preserve">belongsTo</w:t>
+            </w:r>
+          </w:p>
+        </w:tc>
+        <w:tc>
+          <w:p>
+            <w:pPr>
+              <w:jc w:val="left"/>
+            </w:pPr>
+            <w:r>
+              <w:rPr>
+                <w:color w:val="000000"/>
+                <w:rtl w:val="false"/>
+              </w:rPr>
+              <w:t xml:space="preserve">customerId</w:t>
+            </w:r>
+          </w:p>
+        </w:tc>
+      </w:tr>
+      <w:tr>
+        <w:tc>
+          <w:p>
+            <w:pPr>
+              <w:jc w:val="left"/>
+            </w:pPr>
+            <w:r>
+              <w:rPr>
+                <w:color w:val="000000"/>
+                <w:rtl w:val="false"/>
+              </w:rPr>
+              <w:t xml:space="preserve">Stock</w:t>
+            </w:r>
+          </w:p>
+        </w:tc>
+        <w:tc>
+          <w:p>
+            <w:pPr>
+              <w:jc w:val="left"/>
+            </w:pPr>
+            <w:r>
+              <w:rPr>
+                <w:color w:val="000000"/>
+                <w:rtl w:val="false"/>
+              </w:rPr>
+              <w:t xml:space="preserve">Transfer</w:t>
+            </w:r>
+          </w:p>
+        </w:tc>
+        <w:tc>
+          <w:p>
+            <w:pPr>
+              <w:jc w:val="left"/>
+            </w:pPr>
+            <w:r>
+              <w:rPr>
+                <w:color w:val="000000"/>
+                <w:rtl w:val="false"/>
+              </w:rPr>
+              <w:t xml:space="preserve">hasMany</w:t>
+            </w:r>
+          </w:p>
+        </w:tc>
+        <w:tc>
+          <w:p>
+            <w:pPr>
+              <w:jc w:val="left"/>
+            </w:pPr>
+            <w:r>
+              <w:rPr>
+                <w:color w:val="000000"/>
+                <w:rtl w:val="false"/>
+              </w:rPr>
+              <w:t xml:space="preserve">stockId</w:t>
+            </w:r>
+          </w:p>
+        </w:tc>
+      </w:tr>
+      <w:tr>
+        <w:tc>
+          <w:p>
+            <w:pPr>
+              <w:jc w:val="left"/>
+            </w:pPr>
+            <w:r>
+              <w:rPr>
+                <w:color w:val="000000"/>
+                <w:rtl w:val="false"/>
+              </w:rPr>
+              <w:t xml:space="preserve">Transfer</w:t>
+            </w:r>
+          </w:p>
+        </w:tc>
+        <w:tc>
+          <w:p>
+            <w:pPr>
+              <w:jc w:val="left"/>
+            </w:pPr>
+            <w:r>
+              <w:rPr>
+                <w:color w:val="000000"/>
+                <w:rtl w:val="false"/>
+              </w:rPr>
+              <w:t xml:space="preserve">Stock</w:t>
+            </w:r>
+          </w:p>
+        </w:tc>
+        <w:tc>
+          <w:p>
+            <w:pPr>
+              <w:jc w:val="left"/>
+            </w:pPr>
+            <w:r>
+              <w:rPr>
+                <w:color w:val="000000"/>
+                <w:rtl w:val="false"/>
+              </w:rPr>
+              <w:t xml:space="preserve">belongsTo</w:t>
+            </w:r>
+          </w:p>
+        </w:tc>
+        <w:tc>
+          <w:p>
+            <w:pPr>
+              <w:jc w:val="left"/>
+            </w:pPr>
+            <w:r>
+              <w:rPr>
+                <w:color w:val="000000"/>
+                <w:rtl w:val="false"/>
+              </w:rPr>
+              <w:t xml:space="preserve">stockId</w:t>
+            </w:r>
+          </w:p>
+        </w:tc>
+      </w:tr>
+      <w:tr>
+        <w:tc>
+          <w:p>
+            <w:pPr>
+              <w:jc w:val="left"/>
+            </w:pPr>
+            <w:r>
+              <w:rPr>
+                <w:color w:val="000000"/>
+                <w:rtl w:val="false"/>
+              </w:rPr>
+              <w:t xml:space="preserve">User</w:t>
+            </w:r>
+          </w:p>
+        </w:tc>
+        <w:tc>
+          <w:p>
+            <w:pPr>
+              <w:jc w:val="left"/>
+            </w:pPr>
+            <w:r>
+              <w:rPr>
+                <w:color w:val="000000"/>
+                <w:rtl w:val="false"/>
+              </w:rPr>
+              <w:t xml:space="preserve">Transfer</w:t>
+            </w:r>
+          </w:p>
+        </w:tc>
+        <w:tc>
+          <w:p>
+            <w:pPr>
+              <w:jc w:val="left"/>
+            </w:pPr>
+            <w:r>
+              <w:rPr>
+                <w:color w:val="000000"/>
+                <w:rtl w:val="false"/>
+              </w:rPr>
+              <w:t xml:space="preserve">hasMany</w:t>
+            </w:r>
+          </w:p>
+        </w:tc>
+        <w:tc>
+          <w:p>
+            <w:pPr>
+              <w:jc w:val="left"/>
+            </w:pPr>
+            <w:r>
+              <w:rPr>
+                <w:color w:val="000000"/>
+                <w:rtl w:val="false"/>
+              </w:rPr>
+              <w:t xml:space="preserve">userId</w:t>
+            </w:r>
+          </w:p>
+        </w:tc>
+      </w:tr>
+      <w:tr>
+        <w:tc>
+          <w:p>
+            <w:pPr>
+              <w:jc w:val="left"/>
+            </w:pPr>
+            <w:r>
+              <w:rPr>
+                <w:color w:val="000000"/>
+                <w:rtl w:val="false"/>
+              </w:rPr>
+              <w:t xml:space="preserve">Transfer</w:t>
+            </w:r>
+          </w:p>
+        </w:tc>
+        <w:tc>
+          <w:p>
+            <w:pPr>
+              <w:jc w:val="left"/>
+            </w:pPr>
+            <w:r>
+              <w:rPr>
+                <w:color w:val="000000"/>
+                <w:rtl w:val="false"/>
+              </w:rPr>
+              <w:t xml:space="preserve">User</w:t>
+            </w:r>
+          </w:p>
+        </w:tc>
+        <w:tc>
+          <w:p>
+            <w:pPr>
+              <w:jc w:val="left"/>
+            </w:pPr>
+            <w:r>
+              <w:rPr>
+                <w:color w:val="000000"/>
+                <w:rtl w:val="false"/>
+              </w:rPr>
+              <w:t xml:space="preserve">belongsTo</w:t>
+            </w:r>
+          </w:p>
+        </w:tc>
+        <w:tc>
+          <w:p>
+            <w:pPr>
+              <w:jc w:val="left"/>
+            </w:pPr>
+            <w:r>
+              <w:rPr>
+                <w:color w:val="000000"/>
+                <w:rtl w:val="false"/>
+              </w:rPr>
+              <w:t xml:space="preserve">userId</w:t>
             </w:r>
           </w:p>
         </w:tc>
@@ -11873,7 +14165,7 @@
         <w:bidi w:val="false"/>
         <w:spacing w:before="240" w:after="120"/>
       </w:pPr>
-      <w:bookmarkStart w:name="_Toc_APIs_by_resource_1771833788856" w:id="1"/>
+      <w:bookmarkStart w:name="_Toc_APIs_by_resource_1771840706578" w:id="1"/>
       <w:r>
         <w:rPr>
           <w:b w:val="false"/>
@@ -11896,7 +14188,7 @@
         <w:bidi w:val="false"/>
         <w:spacing w:before="240" w:after="120"/>
       </w:pPr>
-      <w:bookmarkStart w:name="_Toc_User_user_1771833788856" w:id="1"/>
+      <w:bookmarkStart w:name="_Toc_User_user_1771840706578" w:id="1"/>
       <w:r>
         <w:rPr>
           <w:b w:val="false"/>
@@ -12446,7 +14738,7 @@
         <w:bidi w:val="false"/>
         <w:spacing w:before="240" w:after="120"/>
       </w:pPr>
-      <w:bookmarkStart w:name="_Toc_UserRole_userRole_1771833788857" w:id="1"/>
+      <w:bookmarkStart w:name="_Toc_UserRole_userRole_1771840706578" w:id="1"/>
       <w:r>
         <w:rPr>
           <w:b w:val="false"/>
@@ -12644,7 +14936,7 @@
         <w:bidi w:val="false"/>
         <w:spacing w:before="240" w:after="120"/>
       </w:pPr>
-      <w:bookmarkStart w:name="_Toc_UserLogs_userLogs_1771833788857" w:id="1"/>
+      <w:bookmarkStart w:name="_Toc_UserLogs_userLogs_1771840706578" w:id="1"/>
       <w:r>
         <w:rPr>
           <w:b w:val="false"/>
@@ -12842,7 +15134,7 @@
         <w:bidi w:val="false"/>
         <w:spacing w:before="240" w:after="120"/>
       </w:pPr>
-      <w:bookmarkStart w:name="_Toc_Category_category_1771833788857" w:id="1"/>
+      <w:bookmarkStart w:name="_Toc_Category_category_1771840706578" w:id="1"/>
       <w:r>
         <w:rPr>
           <w:b w:val="false"/>
@@ -13172,7 +15464,7 @@
         <w:bidi w:val="false"/>
         <w:spacing w:before="240" w:after="120"/>
       </w:pPr>
-      <w:bookmarkStart w:name="_Toc_Model_model_1771833788857" w:id="1"/>
+      <w:bookmarkStart w:name="_Toc_Model_model_1771840706579" w:id="1"/>
       <w:r>
         <w:rPr>
           <w:b w:val="false"/>
@@ -13546,7 +15838,7 @@
         <w:bidi w:val="false"/>
         <w:spacing w:before="240" w:after="120"/>
       </w:pPr>
-      <w:bookmarkStart w:name="_Toc_Stock_stock_1771833788857" w:id="1"/>
+      <w:bookmarkStart w:name="_Toc_Stock_stock_1771840706579" w:id="1"/>
       <w:r>
         <w:rPr>
           <w:b w:val="false"/>
@@ -14008,7 +16300,7 @@
         <w:bidi w:val="false"/>
         <w:spacing w:before="240" w:after="120"/>
       </w:pPr>
-      <w:bookmarkStart w:name="_Toc_Payment_payment_1771833788857" w:id="1"/>
+      <w:bookmarkStart w:name="_Toc_Payment_payment_1771840706579" w:id="1"/>
       <w:r>
         <w:rPr>
           <w:b w:val="false"/>
@@ -14294,7 +16586,7 @@
         <w:bidi w:val="false"/>
         <w:spacing w:before="240" w:after="120"/>
       </w:pPr>
-      <w:bookmarkStart w:name="_Toc_Cash_cash_1771833788857" w:id="1"/>
+      <w:bookmarkStart w:name="_Toc_Cash_cash_1771840706579" w:id="1"/>
       <w:r>
         <w:rPr>
           <w:b w:val="false"/>
@@ -14580,7 +16872,7 @@
         <w:bidi w:val="false"/>
         <w:spacing w:before="240" w:after="120"/>
       </w:pPr>
-      <w:bookmarkStart w:name="_Toc_Lease_lease_1771833788857" w:id="1"/>
+      <w:bookmarkStart w:name="_Toc_Lease_lease_1771840706579" w:id="1"/>
       <w:r>
         <w:rPr>
           <w:b w:val="false"/>
@@ -14910,7 +17202,7 @@
         <w:bidi w:val="false"/>
         <w:spacing w:before="240" w:after="120"/>
       </w:pPr>
-      <w:bookmarkStart w:name="_Toc_Customer_customer_1771833788858" w:id="1"/>
+      <w:bookmarkStart w:name="_Toc_Customer_customer_1771840706579" w:id="1"/>
       <w:r>
         <w:rPr>
           <w:b w:val="false"/>
@@ -15460,7 +17752,7 @@
         <w:bidi w:val="false"/>
         <w:spacing w:before="240" w:after="120"/>
       </w:pPr>
-      <w:bookmarkStart w:name="_Toc_DealerConsignmentNote_dealerConsignmentN_1771833788858" w:id="1"/>
+      <w:bookmarkStart w:name="_Toc_DealerConsignmentNote_dealerConsignmentN_1771840706580" w:id="1"/>
       <w:r>
         <w:rPr>
           <w:b w:val="false"/>
@@ -15878,7 +18170,7 @@
         <w:bidi w:val="false"/>
         <w:spacing w:before="240" w:after="120"/>
       </w:pPr>
-      <w:bookmarkStart w:name="_Toc_ShopDetails_shopDetails_1771833788858" w:id="1"/>
+      <w:bookmarkStart w:name="_Toc_ShopDetails_shopDetails_1771840706580" w:id="1"/>
       <w:r>
         <w:rPr>
           <w:b w:val="false"/>
@@ -16152,6 +18444,886 @@
                 <w:rtl w:val="false"/>
               </w:rPr>
               <w:t xml:space="preserve">Update status</w:t>
+            </w:r>
+          </w:p>
+        </w:tc>
+      </w:tr>
+    </w:tbl>
+    <w:p>
+      <w:pPr>
+        <w:pStyle w:val="3"/>
+        <w:pStyle w:val="Heading3"/>
+        <w:bidi w:val="false"/>
+        <w:spacing w:before="240" w:after="120"/>
+      </w:pPr>
+      <w:bookmarkStart w:name="_Toc_Courier_courier_1771840706580" w:id="1"/>
+      <w:r>
+        <w:rPr>
+          <w:b w:val="false"/>
+          <w:bCs w:val="false"/>
+          <w:i w:val="false"/>
+          <w:iCs w:val="false"/>
+          <w:color w:val="000000"/>
+          <w:sz w:val="24"/>
+          <w:szCs w:val="24"/>
+          <w:rtl w:val="false"/>
+        </w:rPr>
+        <w:t xml:space="preserve">Courier (`/courier`)</w:t>
+      </w:r>
+      <w:bookmarkEnd w:id="1"/>
+    </w:p>
+    <w:tbl>
+      <w:tblPr>
+        <w:tblW w:type="pct" w:w="100%"/>
+        <w:tblBorders>
+          <w:top w:val="single" w:color="auto" w:sz="4"/>
+          <w:left w:val="single" w:color="auto" w:sz="4"/>
+          <w:bottom w:val="single" w:color="auto" w:sz="4"/>
+          <w:right w:val="single" w:color="auto" w:sz="4"/>
+          <w:insideH w:val="single" w:color="auto" w:sz="4"/>
+          <w:insideV w:val="single" w:color="auto" w:sz="4"/>
+        </w:tblBorders>
+        <w:tblLayout w:type="autofit"/>
+        <w:tblCellMar>
+          <w:top w:type="dxa" w:w="100"/>
+          <w:left w:type="dxa" w:w="100"/>
+          <w:bottom w:type="dxa" w:w="100"/>
+          <w:right w:type="dxa" w:w="100"/>
+        </w:tblCellMar>
+      </w:tblPr>
+      <w:tblGrid>
+        <w:gridCol w:w="100"/>
+        <w:gridCol w:w="100"/>
+        <w:gridCol w:w="100"/>
+      </w:tblGrid>
+      <w:tr>
+        <w:trPr>
+          <w:tblHeader/>
+        </w:trPr>
+        <w:tc>
+          <w:tcPr>
+            <w:shd w:fill="F2F2F2"/>
+          </w:tcPr>
+          <w:p>
+            <w:pPr>
+              <w:pStyle w:val="Strong"/>
+              <w:jc w:val="left"/>
+            </w:pPr>
+            <w:r>
+              <w:rPr>
+                <w:b/>
+                <w:bCs/>
+                <w:color w:val="000000"/>
+              </w:rPr>
+              <w:t xml:space="preserve">Method</w:t>
+            </w:r>
+          </w:p>
+        </w:tc>
+        <w:tc>
+          <w:tcPr>
+            <w:shd w:fill="F2F2F2"/>
+          </w:tcPr>
+          <w:p>
+            <w:pPr>
+              <w:pStyle w:val="Strong"/>
+              <w:jc w:val="left"/>
+            </w:pPr>
+            <w:r>
+              <w:rPr>
+                <w:b/>
+                <w:bCs/>
+                <w:color w:val="000000"/>
+              </w:rPr>
+              <w:t xml:space="preserve">Endpoint</w:t>
+            </w:r>
+          </w:p>
+        </w:tc>
+        <w:tc>
+          <w:tcPr>
+            <w:shd w:fill="F2F2F2"/>
+          </w:tcPr>
+          <w:p>
+            <w:pPr>
+              <w:pStyle w:val="Strong"/>
+              <w:jc w:val="left"/>
+            </w:pPr>
+            <w:r>
+              <w:rPr>
+                <w:b/>
+                <w:bCs/>
+                <w:color w:val="000000"/>
+              </w:rPr>
+              <w:t xml:space="preserve">Description</w:t>
+            </w:r>
+          </w:p>
+        </w:tc>
+      </w:tr>
+      <w:tr>
+        <w:tc>
+          <w:p>
+            <w:pPr>
+              <w:jc w:val="left"/>
+            </w:pPr>
+            <w:r>
+              <w:rPr>
+                <w:color w:val="000000"/>
+                <w:rtl w:val="false"/>
+              </w:rPr>
+              <w:t xml:space="preserve">POST</w:t>
+            </w:r>
+          </w:p>
+        </w:tc>
+        <w:tc>
+          <w:p>
+            <w:pPr>
+              <w:jc w:val="left"/>
+            </w:pPr>
+            <w:r>
+              <w:rPr>
+                <w:color w:val="000000"/>
+                <w:rtl w:val="false"/>
+              </w:rPr>
+              <w:t xml:space="preserve">/courier/save</w:t>
+            </w:r>
+          </w:p>
+        </w:tc>
+        <w:tc>
+          <w:p>
+            <w:pPr>
+              <w:jc w:val="left"/>
+            </w:pPr>
+            <w:r>
+              <w:rPr>
+                <w:color w:val="000000"/>
+                <w:rtl w:val="false"/>
+              </w:rPr>
+              <w:t xml:space="preserve">Save courier (categoryId, customerId, name, contactNumber, address, sentDate only)</w:t>
+            </w:r>
+          </w:p>
+        </w:tc>
+      </w:tr>
+      <w:tr>
+        <w:tc>
+          <w:p>
+            <w:pPr>
+              <w:jc w:val="left"/>
+            </w:pPr>
+            <w:r>
+              <w:rPr>
+                <w:color w:val="000000"/>
+                <w:rtl w:val="false"/>
+              </w:rPr>
+              <w:t xml:space="preserve">POST</w:t>
+            </w:r>
+          </w:p>
+        </w:tc>
+        <w:tc>
+          <w:p>
+            <w:pPr>
+              <w:jc w:val="left"/>
+            </w:pPr>
+            <w:r>
+              <w:rPr>
+                <w:color w:val="000000"/>
+                <w:rtl w:val="false"/>
+              </w:rPr>
+              <w:t xml:space="preserve">/courier/received</w:t>
+            </w:r>
+          </w:p>
+        </w:tc>
+        <w:tc>
+          <w:p>
+            <w:pPr>
+              <w:jc w:val="left"/>
+            </w:pPr>
+            <w:r>
+              <w:rPr>
+                <w:color w:val="000000"/>
+                <w:rtl w:val="false"/>
+              </w:rPr>
+              <w:t xml:space="preserve">Mark as received (save receivedDate, receivername, nic only)</w:t>
+            </w:r>
+          </w:p>
+        </w:tc>
+      </w:tr>
+      <w:tr>
+        <w:tc>
+          <w:p>
+            <w:pPr>
+              <w:jc w:val="left"/>
+            </w:pPr>
+            <w:r>
+              <w:rPr>
+                <w:color w:val="000000"/>
+                <w:rtl w:val="false"/>
+              </w:rPr>
+              <w:t xml:space="preserve">POST</w:t>
+            </w:r>
+          </w:p>
+        </w:tc>
+        <w:tc>
+          <w:p>
+            <w:pPr>
+              <w:jc w:val="left"/>
+            </w:pPr>
+            <w:r>
+              <w:rPr>
+                <w:color w:val="000000"/>
+                <w:rtl w:val="false"/>
+              </w:rPr>
+              <w:t xml:space="preserve">/courier/update</w:t>
+            </w:r>
+          </w:p>
+        </w:tc>
+        <w:tc>
+          <w:p>
+            <w:pPr>
+              <w:jc w:val="left"/>
+            </w:pPr>
+            <w:r>
+              <w:rPr>
+                <w:color w:val="000000"/>
+                <w:rtl w:val="false"/>
+              </w:rPr>
+              <w:t xml:space="preserve">Update courier</w:t>
+            </w:r>
+          </w:p>
+        </w:tc>
+      </w:tr>
+      <w:tr>
+        <w:tc>
+          <w:p>
+            <w:pPr>
+              <w:jc w:val="left"/>
+            </w:pPr>
+            <w:r>
+              <w:rPr>
+                <w:color w:val="000000"/>
+                <w:rtl w:val="false"/>
+              </w:rPr>
+              <w:t xml:space="preserve">PUT</w:t>
+            </w:r>
+          </w:p>
+        </w:tc>
+        <w:tc>
+          <w:p>
+            <w:pPr>
+              <w:jc w:val="left"/>
+            </w:pPr>
+            <w:r>
+              <w:rPr>
+                <w:color w:val="000000"/>
+                <w:rtl w:val="false"/>
+              </w:rPr>
+              <w:t xml:space="preserve">/courier/updateStatus</w:t>
+            </w:r>
+          </w:p>
+        </w:tc>
+        <w:tc>
+          <w:p>
+            <w:pPr>
+              <w:jc w:val="left"/>
+            </w:pPr>
+            <w:r>
+              <w:rPr>
+                <w:color w:val="000000"/>
+                <w:rtl w:val="false"/>
+              </w:rPr>
+              <w:t xml:space="preserve">Update status</w:t>
+            </w:r>
+          </w:p>
+        </w:tc>
+      </w:tr>
+      <w:tr>
+        <w:tc>
+          <w:p>
+            <w:pPr>
+              <w:jc w:val="left"/>
+            </w:pPr>
+            <w:r>
+              <w:rPr>
+                <w:color w:val="000000"/>
+                <w:rtl w:val="false"/>
+              </w:rPr>
+              <w:t xml:space="preserve">GET</w:t>
+            </w:r>
+          </w:p>
+        </w:tc>
+        <w:tc>
+          <w:p>
+            <w:pPr>
+              <w:jc w:val="left"/>
+            </w:pPr>
+            <w:r>
+              <w:rPr>
+                <w:color w:val="000000"/>
+                <w:rtl w:val="false"/>
+              </w:rPr>
+              <w:t xml:space="preserve">/courier/getByCategoryId</w:t>
+            </w:r>
+          </w:p>
+        </w:tc>
+        <w:tc>
+          <w:p>
+            <w:pPr>
+              <w:jc w:val="left"/>
+            </w:pPr>
+            <w:r>
+              <w:rPr>
+                <w:color w:val="000000"/>
+                <w:rtl w:val="false"/>
+              </w:rPr>
+              <w:t xml:space="preserve">Get by category ID</w:t>
+            </w:r>
+          </w:p>
+        </w:tc>
+      </w:tr>
+      <w:tr>
+        <w:tc>
+          <w:p>
+            <w:pPr>
+              <w:jc w:val="left"/>
+            </w:pPr>
+            <w:r>
+              <w:rPr>
+                <w:color w:val="000000"/>
+                <w:rtl w:val="false"/>
+              </w:rPr>
+              <w:t xml:space="preserve">GET</w:t>
+            </w:r>
+          </w:p>
+        </w:tc>
+        <w:tc>
+          <w:p>
+            <w:pPr>
+              <w:jc w:val="left"/>
+            </w:pPr>
+            <w:r>
+              <w:rPr>
+                <w:color w:val="000000"/>
+                <w:rtl w:val="false"/>
+              </w:rPr>
+              <w:t xml:space="preserve">/courier/getByCustomerId</w:t>
+            </w:r>
+          </w:p>
+        </w:tc>
+        <w:tc>
+          <w:p>
+            <w:pPr>
+              <w:jc w:val="left"/>
+            </w:pPr>
+            <w:r>
+              <w:rPr>
+                <w:color w:val="000000"/>
+                <w:rtl w:val="false"/>
+              </w:rPr>
+              <w:t xml:space="preserve">Get by customer ID</w:t>
+            </w:r>
+          </w:p>
+        </w:tc>
+      </w:tr>
+      <w:tr>
+        <w:tc>
+          <w:p>
+            <w:pPr>
+              <w:jc w:val="left"/>
+            </w:pPr>
+            <w:r>
+              <w:rPr>
+                <w:color w:val="000000"/>
+                <w:rtl w:val="false"/>
+              </w:rPr>
+              <w:t xml:space="preserve">GET</w:t>
+            </w:r>
+          </w:p>
+        </w:tc>
+        <w:tc>
+          <w:p>
+            <w:pPr>
+              <w:jc w:val="left"/>
+            </w:pPr>
+            <w:r>
+              <w:rPr>
+                <w:color w:val="000000"/>
+                <w:rtl w:val="false"/>
+              </w:rPr>
+              <w:t xml:space="preserve">/courier/getByName</w:t>
+            </w:r>
+          </w:p>
+        </w:tc>
+        <w:tc>
+          <w:p>
+            <w:pPr>
+              <w:jc w:val="left"/>
+            </w:pPr>
+            <w:r>
+              <w:rPr>
+                <w:color w:val="000000"/>
+                <w:rtl w:val="false"/>
+              </w:rPr>
+              <w:t xml:space="preserve">Get by name</w:t>
+            </w:r>
+          </w:p>
+        </w:tc>
+      </w:tr>
+      <w:tr>
+        <w:tc>
+          <w:p>
+            <w:pPr>
+              <w:jc w:val="left"/>
+            </w:pPr>
+            <w:r>
+              <w:rPr>
+                <w:color w:val="000000"/>
+                <w:rtl w:val="false"/>
+              </w:rPr>
+              <w:t xml:space="preserve">GET</w:t>
+            </w:r>
+          </w:p>
+        </w:tc>
+        <w:tc>
+          <w:p>
+            <w:pPr>
+              <w:jc w:val="left"/>
+            </w:pPr>
+            <w:r>
+              <w:rPr>
+                <w:color w:val="000000"/>
+                <w:rtl w:val="false"/>
+              </w:rPr>
+              <w:t xml:space="preserve">/courier/getByReceiverName</w:t>
+            </w:r>
+          </w:p>
+        </w:tc>
+        <w:tc>
+          <w:p>
+            <w:pPr>
+              <w:jc w:val="left"/>
+            </w:pPr>
+            <w:r>
+              <w:rPr>
+                <w:color w:val="000000"/>
+                <w:rtl w:val="false"/>
+              </w:rPr>
+              <w:t xml:space="preserve">Get by receiver name</w:t>
+            </w:r>
+          </w:p>
+        </w:tc>
+      </w:tr>
+    </w:tbl>
+    <w:p>
+      <w:pPr>
+        <w:pStyle w:val="3"/>
+        <w:pStyle w:val="Heading3"/>
+        <w:bidi w:val="false"/>
+        <w:spacing w:before="240" w:after="120"/>
+      </w:pPr>
+      <w:bookmarkStart w:name="_Toc_Transfer_transfer_1771840706580" w:id="1"/>
+      <w:r>
+        <w:rPr>
+          <w:b w:val="false"/>
+          <w:bCs w:val="false"/>
+          <w:i w:val="false"/>
+          <w:iCs w:val="false"/>
+          <w:color w:val="000000"/>
+          <w:sz w:val="24"/>
+          <w:szCs w:val="24"/>
+          <w:rtl w:val="false"/>
+        </w:rPr>
+        <w:t xml:space="preserve">Transfer (`/transfer`)</w:t>
+      </w:r>
+      <w:bookmarkEnd w:id="1"/>
+    </w:p>
+    <w:tbl>
+      <w:tblPr>
+        <w:tblW w:type="pct" w:w="100%"/>
+        <w:tblBorders>
+          <w:top w:val="single" w:color="auto" w:sz="4"/>
+          <w:left w:val="single" w:color="auto" w:sz="4"/>
+          <w:bottom w:val="single" w:color="auto" w:sz="4"/>
+          <w:right w:val="single" w:color="auto" w:sz="4"/>
+          <w:insideH w:val="single" w:color="auto" w:sz="4"/>
+          <w:insideV w:val="single" w:color="auto" w:sz="4"/>
+        </w:tblBorders>
+        <w:tblLayout w:type="autofit"/>
+        <w:tblCellMar>
+          <w:top w:type="dxa" w:w="100"/>
+          <w:left w:type="dxa" w:w="100"/>
+          <w:bottom w:type="dxa" w:w="100"/>
+          <w:right w:type="dxa" w:w="100"/>
+        </w:tblCellMar>
+      </w:tblPr>
+      <w:tblGrid>
+        <w:gridCol w:w="100"/>
+        <w:gridCol w:w="100"/>
+        <w:gridCol w:w="100"/>
+      </w:tblGrid>
+      <w:tr>
+        <w:trPr>
+          <w:tblHeader/>
+        </w:trPr>
+        <w:tc>
+          <w:tcPr>
+            <w:shd w:fill="F2F2F2"/>
+          </w:tcPr>
+          <w:p>
+            <w:pPr>
+              <w:pStyle w:val="Strong"/>
+              <w:jc w:val="left"/>
+            </w:pPr>
+            <w:r>
+              <w:rPr>
+                <w:b/>
+                <w:bCs/>
+                <w:color w:val="000000"/>
+              </w:rPr>
+              <w:t xml:space="preserve">Method</w:t>
+            </w:r>
+          </w:p>
+        </w:tc>
+        <w:tc>
+          <w:tcPr>
+            <w:shd w:fill="F2F2F2"/>
+          </w:tcPr>
+          <w:p>
+            <w:pPr>
+              <w:pStyle w:val="Strong"/>
+              <w:jc w:val="left"/>
+            </w:pPr>
+            <w:r>
+              <w:rPr>
+                <w:b/>
+                <w:bCs/>
+                <w:color w:val="000000"/>
+              </w:rPr>
+              <w:t xml:space="preserve">Endpoint</w:t>
+            </w:r>
+          </w:p>
+        </w:tc>
+        <w:tc>
+          <w:tcPr>
+            <w:shd w:fill="F2F2F2"/>
+          </w:tcPr>
+          <w:p>
+            <w:pPr>
+              <w:pStyle w:val="Strong"/>
+              <w:jc w:val="left"/>
+            </w:pPr>
+            <w:r>
+              <w:rPr>
+                <w:b/>
+                <w:bCs/>
+                <w:color w:val="000000"/>
+              </w:rPr>
+              <w:t xml:space="preserve">Description</w:t>
+            </w:r>
+          </w:p>
+        </w:tc>
+      </w:tr>
+      <w:tr>
+        <w:tc>
+          <w:p>
+            <w:pPr>
+              <w:jc w:val="left"/>
+            </w:pPr>
+            <w:r>
+              <w:rPr>
+                <w:color w:val="000000"/>
+                <w:rtl w:val="false"/>
+              </w:rPr>
+              <w:t xml:space="preserve">POST</w:t>
+            </w:r>
+          </w:p>
+        </w:tc>
+        <w:tc>
+          <w:p>
+            <w:pPr>
+              <w:jc w:val="left"/>
+            </w:pPr>
+            <w:r>
+              <w:rPr>
+                <w:color w:val="000000"/>
+                <w:rtl w:val="false"/>
+              </w:rPr>
+              <w:t xml:space="preserve">/transfer/save</w:t>
+            </w:r>
+          </w:p>
+        </w:tc>
+        <w:tc>
+          <w:p>
+            <w:pPr>
+              <w:jc w:val="left"/>
+            </w:pPr>
+            <w:r>
+              <w:rPr>
+                <w:color w:val="000000"/>
+                <w:rtl w:val="false"/>
+              </w:rPr>
+              <w:t xml:space="preserve">Save transfer</w:t>
+            </w:r>
+          </w:p>
+        </w:tc>
+      </w:tr>
+      <w:tr>
+        <w:tc>
+          <w:p>
+            <w:pPr>
+              <w:jc w:val="left"/>
+            </w:pPr>
+            <w:r>
+              <w:rPr>
+                <w:color w:val="000000"/>
+                <w:rtl w:val="false"/>
+              </w:rPr>
+              <w:t xml:space="preserve">POST</w:t>
+            </w:r>
+          </w:p>
+        </w:tc>
+        <w:tc>
+          <w:p>
+            <w:pPr>
+              <w:jc w:val="left"/>
+            </w:pPr>
+            <w:r>
+              <w:rPr>
+                <w:color w:val="000000"/>
+                <w:rtl w:val="false"/>
+              </w:rPr>
+              <w:t xml:space="preserve">/transfer/update</w:t>
+            </w:r>
+          </w:p>
+        </w:tc>
+        <w:tc>
+          <w:p>
+            <w:pPr>
+              <w:jc w:val="left"/>
+            </w:pPr>
+            <w:r>
+              <w:rPr>
+                <w:color w:val="000000"/>
+                <w:rtl w:val="false"/>
+              </w:rPr>
+              <w:t xml:space="preserve">Update transfer</w:t>
+            </w:r>
+          </w:p>
+        </w:tc>
+      </w:tr>
+      <w:tr>
+        <w:tc>
+          <w:p>
+            <w:pPr>
+              <w:jc w:val="left"/>
+            </w:pPr>
+            <w:r>
+              <w:rPr>
+                <w:color w:val="000000"/>
+                <w:rtl w:val="false"/>
+              </w:rPr>
+              <w:t xml:space="preserve">PUT</w:t>
+            </w:r>
+          </w:p>
+        </w:tc>
+        <w:tc>
+          <w:p>
+            <w:pPr>
+              <w:jc w:val="left"/>
+            </w:pPr>
+            <w:r>
+              <w:rPr>
+                <w:color w:val="000000"/>
+                <w:rtl w:val="false"/>
+              </w:rPr>
+              <w:t xml:space="preserve">/transfer/updateStatus</w:t>
+            </w:r>
+          </w:p>
+        </w:tc>
+        <w:tc>
+          <w:p>
+            <w:pPr>
+              <w:jc w:val="left"/>
+            </w:pPr>
+            <w:r>
+              <w:rPr>
+                <w:color w:val="000000"/>
+                <w:rtl w:val="false"/>
+              </w:rPr>
+              <w:t xml:space="preserve">Update status</w:t>
+            </w:r>
+          </w:p>
+        </w:tc>
+      </w:tr>
+      <w:tr>
+        <w:tc>
+          <w:p>
+            <w:pPr>
+              <w:jc w:val="left"/>
+            </w:pPr>
+            <w:r>
+              <w:rPr>
+                <w:color w:val="000000"/>
+                <w:rtl w:val="false"/>
+              </w:rPr>
+              <w:t xml:space="preserve">GET</w:t>
+            </w:r>
+          </w:p>
+        </w:tc>
+        <w:tc>
+          <w:p>
+            <w:pPr>
+              <w:jc w:val="left"/>
+            </w:pPr>
+            <w:r>
+              <w:rPr>
+                <w:color w:val="000000"/>
+                <w:rtl w:val="false"/>
+              </w:rPr>
+              <w:t xml:space="preserve">/transfer/getByStockId</w:t>
+            </w:r>
+          </w:p>
+        </w:tc>
+        <w:tc>
+          <w:p>
+            <w:pPr>
+              <w:jc w:val="left"/>
+            </w:pPr>
+            <w:r>
+              <w:rPr>
+                <w:color w:val="000000"/>
+                <w:rtl w:val="false"/>
+              </w:rPr>
+              <w:t xml:space="preserve">Get by stock ID</w:t>
+            </w:r>
+          </w:p>
+        </w:tc>
+      </w:tr>
+      <w:tr>
+        <w:tc>
+          <w:p>
+            <w:pPr>
+              <w:jc w:val="left"/>
+            </w:pPr>
+            <w:r>
+              <w:rPr>
+                <w:color w:val="000000"/>
+                <w:rtl w:val="false"/>
+              </w:rPr>
+              <w:t xml:space="preserve">GET</w:t>
+            </w:r>
+          </w:p>
+        </w:tc>
+        <w:tc>
+          <w:p>
+            <w:pPr>
+              <w:jc w:val="left"/>
+            </w:pPr>
+            <w:r>
+              <w:rPr>
+                <w:color w:val="000000"/>
+                <w:rtl w:val="false"/>
+              </w:rPr>
+              <w:t xml:space="preserve">/transfer/getByCompanyName</w:t>
+            </w:r>
+          </w:p>
+        </w:tc>
+        <w:tc>
+          <w:p>
+            <w:pPr>
+              <w:jc w:val="left"/>
+            </w:pPr>
+            <w:r>
+              <w:rPr>
+                <w:color w:val="000000"/>
+                <w:rtl w:val="false"/>
+              </w:rPr>
+              <w:t xml:space="preserve">Get by company name</w:t>
+            </w:r>
+          </w:p>
+        </w:tc>
+      </w:tr>
+      <w:tr>
+        <w:tc>
+          <w:p>
+            <w:pPr>
+              <w:jc w:val="left"/>
+            </w:pPr>
+            <w:r>
+              <w:rPr>
+                <w:color w:val="000000"/>
+                <w:rtl w:val="false"/>
+              </w:rPr>
+              <w:t xml:space="preserve">GET</w:t>
+            </w:r>
+          </w:p>
+        </w:tc>
+        <w:tc>
+          <w:p>
+            <w:pPr>
+              <w:jc w:val="left"/>
+            </w:pPr>
+            <w:r>
+              <w:rPr>
+                <w:color w:val="000000"/>
+                <w:rtl w:val="false"/>
+              </w:rPr>
+              <w:t xml:space="preserve">/transfer/getByUserId</w:t>
+            </w:r>
+          </w:p>
+        </w:tc>
+        <w:tc>
+          <w:p>
+            <w:pPr>
+              <w:jc w:val="left"/>
+            </w:pPr>
+            <w:r>
+              <w:rPr>
+                <w:color w:val="000000"/>
+                <w:rtl w:val="false"/>
+              </w:rPr>
+              <w:t xml:space="preserve">Get by user ID</w:t>
+            </w:r>
+          </w:p>
+        </w:tc>
+      </w:tr>
+      <w:tr>
+        <w:tc>
+          <w:p>
+            <w:pPr>
+              <w:jc w:val="left"/>
+            </w:pPr>
+            <w:r>
+              <w:rPr>
+                <w:color w:val="000000"/>
+                <w:rtl w:val="false"/>
+              </w:rPr>
+              <w:t xml:space="preserve">GET</w:t>
+            </w:r>
+          </w:p>
+        </w:tc>
+        <w:tc>
+          <w:p>
+            <w:pPr>
+              <w:jc w:val="left"/>
+            </w:pPr>
+            <w:r>
+              <w:rPr>
+                <w:color w:val="000000"/>
+                <w:rtl w:val="false"/>
+              </w:rPr>
+              <w:t xml:space="preserve">/transfer/getByReceiverName</w:t>
+            </w:r>
+          </w:p>
+        </w:tc>
+        <w:tc>
+          <w:p>
+            <w:pPr>
+              <w:jc w:val="left"/>
+            </w:pPr>
+            <w:r>
+              <w:rPr>
+                <w:color w:val="000000"/>
+                <w:rtl w:val="false"/>
+              </w:rPr>
+              <w:t xml:space="preserve">Get by receiver name (companyName)</w:t>
             </w:r>
           </w:p>
         </w:tc>

</xml_diff>